<commit_message>
introduced variable configuration and all json configurations enabling scaling and customisability... expecting a lot of db-code mismatched, will be fixed with the next update
</commit_message>
<xml_diff>
--- a/notes/mathsv1.docx
+++ b/notes/mathsv1.docx
@@ -94,6 +94,54 @@
     </w:p>
     <w:p>
       <w:pPr>
+        <w:pStyle w:val="ListParagraph"/>
+        <w:numPr>
+          <w:ilvl w:val="0"/>
+          <w:numId w:val="1"/>
+        </w:numPr>
+      </w:pPr>
+      <w:r>
+        <w:t>Activity (A)</w:t>
+      </w:r>
+    </w:p>
+    <w:p>
+      <w:pPr>
+        <w:pStyle w:val="ListParagraph"/>
+        <w:numPr>
+          <w:ilvl w:val="0"/>
+          <w:numId w:val="1"/>
+        </w:numPr>
+      </w:pPr>
+      <w:r>
+        <w:t>Cohesion (C)</w:t>
+      </w:r>
+    </w:p>
+    <w:p>
+      <w:pPr>
+        <w:pStyle w:val="ListParagraph"/>
+        <w:numPr>
+          <w:ilvl w:val="0"/>
+          <w:numId w:val="1"/>
+        </w:numPr>
+      </w:pPr>
+      <w:r>
+        <w:t>Density (D)</w:t>
+      </w:r>
+    </w:p>
+    <w:p>
+      <w:pPr>
+        <w:pStyle w:val="ListParagraph"/>
+        <w:numPr>
+          <w:ilvl w:val="0"/>
+          <w:numId w:val="1"/>
+        </w:numPr>
+      </w:pPr>
+      <w:r>
+        <w:t>Entropy (E)</w:t>
+      </w:r>
+    </w:p>
+    <w:p>
+      <w:pPr>
         <w:ind w:left="48"/>
       </w:pPr>
     </w:p>
@@ -175,6 +223,12 @@
           <w:b/>
         </w:rPr>
         <w:t>Gravitational Intensity (G)</w:t>
+      </w:r>
+      <w:r>
+        <w:rPr>
+          <w:b/>
+        </w:rPr>
+        <w:t xml:space="preserve"> – Defined for orbits</w:t>
       </w:r>
     </w:p>
     <w:p>
@@ -819,6 +873,12 @@
           <w:b/>
         </w:rPr>
         <w:t>Mutual Closeness (M)</w:t>
+      </w:r>
+      <w:r>
+        <w:rPr>
+          <w:b/>
+        </w:rPr>
+        <w:t xml:space="preserve"> – Defined for orbits</w:t>
       </w:r>
     </w:p>
     <w:p>
@@ -1676,6 +1736,12 @@
         </w:rPr>
         <w:t>Relation Inertia (I)</w:t>
       </w:r>
+      <w:r>
+        <w:rPr>
+          <w:b/>
+        </w:rPr>
+        <w:t xml:space="preserve"> – Defined for orbits</w:t>
+      </w:r>
     </w:p>
     <w:p>
       <w:pPr>
@@ -1715,6 +1781,12 @@
           <w:b/>
         </w:rPr>
         <w:t>Recency (Q)</w:t>
+      </w:r>
+      <w:r>
+        <w:rPr>
+          <w:b/>
+        </w:rPr>
+        <w:t xml:space="preserve"> – Defined for orbits</w:t>
       </w:r>
     </w:p>
     <w:p>
@@ -1919,13 +1991,7 @@
           <w:rPr>
             <w:rFonts w:ascii="Cambria Math" w:eastAsiaTheme="minorEastAsia" w:hAnsi="Cambria Math"/>
           </w:rPr>
-          <m:t>=</m:t>
-        </m:r>
-        <m:r>
-          <w:rPr>
-            <w:rFonts w:ascii="Cambria Math" w:eastAsiaTheme="minorEastAsia" w:hAnsi="Cambria Math"/>
-          </w:rPr>
-          <m:t>-</m:t>
+          <m:t>=-</m:t>
         </m:r>
         <m:f>
           <m:fPr>
@@ -1957,13 +2023,7 @@
           <w:rPr>
             <w:rFonts w:ascii="Cambria Math" w:eastAsiaTheme="minorEastAsia" w:hAnsi="Cambria Math"/>
           </w:rPr>
-          <m:t>+</m:t>
-        </m:r>
-        <m:r>
-          <w:rPr>
-            <w:rFonts w:ascii="Cambria Math" w:eastAsiaTheme="minorEastAsia" w:hAnsi="Cambria Math"/>
-          </w:rPr>
-          <m:t>1</m:t>
+          <m:t>+1</m:t>
         </m:r>
       </m:oMath>
       <w:r>
@@ -2476,13 +2536,7 @@
                                           <w:rPr>
                                             <w:rFonts w:ascii="Cambria Math" w:hAnsi="Cambria Math"/>
                                           </w:rPr>
-                                          <m:t>0 ,</m:t>
-                                        </m:r>
-                                        <m:r>
-                                          <w:rPr>
-                                            <w:rFonts w:ascii="Cambria Math" w:hAnsi="Cambria Math"/>
-                                          </w:rPr>
-                                          <m:t xml:space="preserve"> </m:t>
+                                          <m:t xml:space="preserve">0 , </m:t>
                                         </m:r>
                                         <m:d>
                                           <m:dPr>
@@ -2558,19 +2612,7 @@
                                           <w:rPr>
                                             <w:rFonts w:ascii="Cambria Math" w:hAnsi="Cambria Math"/>
                                           </w:rPr>
-                                          <m:t>&gt;</m:t>
-                                        </m:r>
-                                        <m:r>
-                                          <w:rPr>
-                                            <w:rFonts w:ascii="Cambria Math" w:hAnsi="Cambria Math"/>
-                                          </w:rPr>
-                                          <m:t>288</m:t>
-                                        </m:r>
-                                        <m:r>
-                                          <w:rPr>
-                                            <w:rFonts w:ascii="Cambria Math" w:hAnsi="Cambria Math"/>
-                                          </w:rPr>
-                                          <m:t xml:space="preserve">0 </m:t>
+                                          <m:t xml:space="preserve">&gt;2880 </m:t>
                                         </m:r>
                                       </m:e>
                                     </m:eqArr>
@@ -3096,9 +3138,10 @@
     <w:p>
       <w:pPr>
         <w:pStyle w:val="ListParagraph"/>
-      </w:pPr>
-      <w:bookmarkStart w:id="0" w:name="_GoBack"/>
-      <w:bookmarkEnd w:id="0"/>
+        <w:rPr>
+          <w:rFonts w:eastAsiaTheme="minorEastAsia"/>
+        </w:rPr>
+      </w:pPr>
       <m:oMathPara>
         <m:oMath>
           <m:r>
@@ -3135,6 +3178,3196 @@
           </m:d>
         </m:oMath>
       </m:oMathPara>
+    </w:p>
+    <w:p>
+      <w:pPr>
+        <w:pStyle w:val="ListParagraph"/>
+        <w:numPr>
+          <w:ilvl w:val="0"/>
+          <w:numId w:val="2"/>
+        </w:numPr>
+      </w:pPr>
+      <w:r>
+        <w:rPr>
+          <w:b/>
+        </w:rPr>
+        <w:t xml:space="preserve">Activity (A) – Defined for </w:t>
+      </w:r>
+      <w:proofErr w:type="spellStart"/>
+      <w:r>
+        <w:rPr>
+          <w:b/>
+        </w:rPr>
+        <w:t>solars</w:t>
+      </w:r>
+      <w:proofErr w:type="spellEnd"/>
+    </w:p>
+    <w:p>
+      <w:pPr>
+        <w:pStyle w:val="ListParagraph"/>
+      </w:pPr>
+    </w:p>
+    <w:p>
+      <w:pPr>
+        <w:pStyle w:val="ListParagraph"/>
+        <w:rPr>
+          <w:rFonts w:eastAsiaTheme="minorEastAsia"/>
+        </w:rPr>
+      </w:pPr>
+      <w:r>
+        <w:t xml:space="preserve">Activity is a measure of bare volume of group chats with respect to expected average messages using a general relation </w:t>
+      </w:r>
+      <m:oMath>
+        <m:r>
+          <w:rPr>
+            <w:rFonts w:ascii="Cambria Math" w:hAnsi="Cambria Math"/>
+          </w:rPr>
+          <m:t>n≅</m:t>
+        </m:r>
+        <m:r>
+          <w:rPr>
+            <w:rFonts w:ascii="Cambria Math" w:hAnsi="Cambria Math"/>
+          </w:rPr>
+          <m:t>7.</m:t>
+        </m:r>
+        <m:r>
+          <w:rPr>
+            <w:rFonts w:ascii="Cambria Math" w:hAnsi="Cambria Math"/>
+          </w:rPr>
+          <m:t>k.</m:t>
+        </m:r>
+        <m:sSup>
+          <m:sSupPr>
+            <m:ctrlPr>
+              <w:rPr>
+                <w:rFonts w:ascii="Cambria Math" w:hAnsi="Cambria Math"/>
+                <w:i/>
+              </w:rPr>
+            </m:ctrlPr>
+          </m:sSupPr>
+          <m:e>
+            <m:r>
+              <w:rPr>
+                <w:rFonts w:ascii="Cambria Math" w:hAnsi="Cambria Math"/>
+              </w:rPr>
+              <m:t>m</m:t>
+            </m:r>
+          </m:e>
+          <m:sup>
+            <m:r>
+              <w:rPr>
+                <w:rFonts w:ascii="Cambria Math" w:hAnsi="Cambria Math"/>
+              </w:rPr>
+              <m:t>1.3</m:t>
+            </m:r>
+          </m:sup>
+        </m:sSup>
+      </m:oMath>
+      <w:r>
+        <w:rPr>
+          <w:rFonts w:eastAsiaTheme="minorEastAsia"/>
+        </w:rPr>
+        <w:t xml:space="preserve"> where k is a</w:t>
+      </w:r>
+      <w:r>
+        <w:rPr>
+          <w:rFonts w:eastAsiaTheme="minorEastAsia"/>
+        </w:rPr>
+        <w:t xml:space="preserve">n adjustable </w:t>
+      </w:r>
+      <w:r>
+        <w:rPr>
+          <w:rFonts w:eastAsiaTheme="minorEastAsia"/>
+        </w:rPr>
+        <w:t xml:space="preserve">constant (generally 5 for an </w:t>
+      </w:r>
+      <w:proofErr w:type="spellStart"/>
+      <w:r>
+        <w:rPr>
+          <w:rFonts w:eastAsiaTheme="minorEastAsia"/>
+        </w:rPr>
+        <w:t>avg</w:t>
+      </w:r>
+      <w:proofErr w:type="spellEnd"/>
+      <w:r>
+        <w:rPr>
+          <w:rFonts w:eastAsiaTheme="minorEastAsia"/>
+        </w:rPr>
+        <w:t xml:space="preserve"> group chat).</w:t>
+      </w:r>
+    </w:p>
+    <w:p>
+      <w:pPr>
+        <w:pStyle w:val="ListParagraph"/>
+      </w:pPr>
+    </w:p>
+    <w:p>
+      <w:pPr>
+        <w:pStyle w:val="ListParagraph"/>
+        <w:rPr>
+          <w:rFonts w:eastAsiaTheme="minorEastAsia"/>
+        </w:rPr>
+      </w:pPr>
+      <w:r>
+        <w:t>Function receives the number of members (</w:t>
+      </w:r>
+      <m:oMath>
+        <m:r>
+          <w:rPr>
+            <w:rFonts w:ascii="Cambria Math" w:hAnsi="Cambria Math"/>
+          </w:rPr>
+          <m:t>m</m:t>
+        </m:r>
+      </m:oMath>
+      <w:r>
+        <w:t xml:space="preserve">), </w:t>
+      </w:r>
+      <w:proofErr w:type="spellStart"/>
+      <w:proofErr w:type="gramStart"/>
+      <w:r>
+        <w:t>Solars.msgdata.member</w:t>
+      </w:r>
+      <w:proofErr w:type="gramEnd"/>
+      <w:r>
+        <w:t>_data</w:t>
+      </w:r>
+      <w:proofErr w:type="spellEnd"/>
+      <w:r>
+        <w:t>. Then it sums up all the messages sent by users</w:t>
+      </w:r>
+      <w:r>
+        <w:t xml:space="preserve"> across the week</w:t>
+      </w:r>
+      <w:r>
+        <w:t xml:space="preserve"> (</w:t>
+      </w:r>
+      <m:oMath>
+        <m:r>
+          <w:rPr>
+            <w:rFonts w:ascii="Cambria Math" w:hAnsi="Cambria Math"/>
+          </w:rPr>
+          <m:t>N</m:t>
+        </m:r>
+      </m:oMath>
+      <w:r>
+        <w:t xml:space="preserve">) and calculates how far </w:t>
+      </w:r>
+      <m:oMath>
+        <m:r>
+          <w:rPr>
+            <w:rFonts w:ascii="Cambria Math" w:hAnsi="Cambria Math"/>
+          </w:rPr>
+          <m:t>N</m:t>
+        </m:r>
+      </m:oMath>
+      <w:r>
+        <w:rPr>
+          <w:rFonts w:eastAsiaTheme="minorEastAsia"/>
+        </w:rPr>
+        <w:t xml:space="preserve"> is from </w:t>
+      </w:r>
+      <m:oMath>
+        <m:r>
+          <w:rPr>
+            <w:rFonts w:ascii="Cambria Math" w:eastAsiaTheme="minorEastAsia" w:hAnsi="Cambria Math"/>
+          </w:rPr>
+          <m:t>k.</m:t>
+        </m:r>
+        <m:sSup>
+          <m:sSupPr>
+            <m:ctrlPr>
+              <w:rPr>
+                <w:rFonts w:ascii="Cambria Math" w:eastAsiaTheme="minorEastAsia" w:hAnsi="Cambria Math"/>
+                <w:i/>
+              </w:rPr>
+            </m:ctrlPr>
+          </m:sSupPr>
+          <m:e>
+            <m:r>
+              <w:rPr>
+                <w:rFonts w:ascii="Cambria Math" w:eastAsiaTheme="minorEastAsia" w:hAnsi="Cambria Math"/>
+              </w:rPr>
+              <m:t>m</m:t>
+            </m:r>
+          </m:e>
+          <m:sup>
+            <m:r>
+              <w:rPr>
+                <w:rFonts w:ascii="Cambria Math" w:eastAsiaTheme="minorEastAsia" w:hAnsi="Cambria Math"/>
+              </w:rPr>
+              <m:t>1.3</m:t>
+            </m:r>
+          </m:sup>
+        </m:sSup>
+      </m:oMath>
+      <w:r>
+        <w:rPr>
+          <w:rFonts w:eastAsiaTheme="minorEastAsia"/>
+        </w:rPr>
+        <w:t>.</w:t>
+      </w:r>
+      <w:r>
+        <w:rPr>
+          <w:rFonts w:eastAsiaTheme="minorEastAsia"/>
+        </w:rPr>
+        <w:t xml:space="preserve"> Where </w:t>
+      </w:r>
+      <m:oMath>
+        <m:r>
+          <w:rPr>
+            <w:rFonts w:ascii="Cambria Math" w:eastAsiaTheme="minorEastAsia" w:hAnsi="Cambria Math"/>
+          </w:rPr>
+          <m:t>M=7.k.</m:t>
+        </m:r>
+        <m:sSup>
+          <m:sSupPr>
+            <m:ctrlPr>
+              <w:rPr>
+                <w:rFonts w:ascii="Cambria Math" w:eastAsiaTheme="minorEastAsia" w:hAnsi="Cambria Math"/>
+                <w:i/>
+              </w:rPr>
+            </m:ctrlPr>
+          </m:sSupPr>
+          <m:e>
+            <m:r>
+              <w:rPr>
+                <w:rFonts w:ascii="Cambria Math" w:eastAsiaTheme="minorEastAsia" w:hAnsi="Cambria Math"/>
+              </w:rPr>
+              <m:t>m</m:t>
+            </m:r>
+          </m:e>
+          <m:sup>
+            <m:r>
+              <w:rPr>
+                <w:rFonts w:ascii="Cambria Math" w:eastAsiaTheme="minorEastAsia" w:hAnsi="Cambria Math"/>
+              </w:rPr>
+              <m:t>1.3</m:t>
+            </m:r>
+          </m:sup>
+        </m:sSup>
+      </m:oMath>
+      <w:r>
+        <w:rPr>
+          <w:rFonts w:eastAsiaTheme="minorEastAsia"/>
+        </w:rPr>
+        <w:t>.</w:t>
+      </w:r>
+    </w:p>
+    <w:p>
+      <w:pPr>
+        <w:pStyle w:val="ListParagraph"/>
+      </w:pPr>
+    </w:p>
+    <w:p>
+      <w:pPr>
+        <w:pStyle w:val="ListParagraph"/>
+      </w:pPr>
+    </w:p>
+    <w:p>
+      <w:pPr>
+        <w:pStyle w:val="ListParagraph"/>
+      </w:pPr>
+      <w:r>
+        <w:rPr>
+          <w:noProof/>
+        </w:rPr>
+        <mc:AlternateContent>
+          <mc:Choice Requires="wps">
+            <w:drawing>
+              <wp:anchor distT="45720" distB="45720" distL="114300" distR="114300" simplePos="0" relativeHeight="251665408" behindDoc="0" locked="0" layoutInCell="1" allowOverlap="1">
+                <wp:simplePos x="0" y="0"/>
+                <wp:positionH relativeFrom="margin">
+                  <wp:align>center</wp:align>
+                </wp:positionH>
+                <wp:positionV relativeFrom="paragraph">
+                  <wp:posOffset>5080</wp:posOffset>
+                </wp:positionV>
+                <wp:extent cx="2103120" cy="1404620"/>
+                <wp:effectExtent l="0" t="0" r="11430" b="13970"/>
+                <wp:wrapSquare wrapText="bothSides"/>
+                <wp:docPr id="3" name="Text Box 2"/>
+                <wp:cNvGraphicFramePr>
+                  <a:graphicFrameLocks xmlns:a="http://schemas.openxmlformats.org/drawingml/2006/main"/>
+                </wp:cNvGraphicFramePr>
+                <a:graphic xmlns:a="http://schemas.openxmlformats.org/drawingml/2006/main">
+                  <a:graphicData uri="http://schemas.microsoft.com/office/word/2010/wordprocessingShape">
+                    <wps:wsp>
+                      <wps:cNvSpPr txBox="1">
+                        <a:spLocks noChangeArrowheads="1"/>
+                      </wps:cNvSpPr>
+                      <wps:spPr bwMode="auto">
+                        <a:xfrm>
+                          <a:off x="0" y="0"/>
+                          <a:ext cx="2103120" cy="1404620"/>
+                        </a:xfrm>
+                        <a:prstGeom prst="rect">
+                          <a:avLst/>
+                        </a:prstGeom>
+                        <a:solidFill>
+                          <a:srgbClr val="FFFFFF"/>
+                        </a:solidFill>
+                        <a:ln w="9525">
+                          <a:solidFill>
+                            <a:srgbClr val="000000"/>
+                          </a:solidFill>
+                          <a:miter lim="800000"/>
+                          <a:headEnd/>
+                          <a:tailEnd/>
+                        </a:ln>
+                      </wps:spPr>
+                      <wps:txbx>
+                        <w:txbxContent>
+                          <w:p>
+                            <m:oMathPara>
+                              <m:oMath>
+                                <m:r>
+                                  <w:rPr>
+                                    <w:rFonts w:ascii="Cambria Math" w:hAnsi="Cambria Math"/>
+                                  </w:rPr>
+                                  <m:t>A=f</m:t>
+                                </m:r>
+                                <m:d>
+                                  <m:dPr>
+                                    <m:ctrlPr>
+                                      <w:rPr>
+                                        <w:rFonts w:ascii="Cambria Math" w:hAnsi="Cambria Math"/>
+                                        <w:i/>
+                                      </w:rPr>
+                                    </m:ctrlPr>
+                                  </m:dPr>
+                                  <m:e>
+                                    <m:r>
+                                      <w:rPr>
+                                        <w:rFonts w:ascii="Cambria Math" w:hAnsi="Cambria Math"/>
+                                      </w:rPr>
+                                      <m:t>N,m</m:t>
+                                    </m:r>
+                                  </m:e>
+                                </m:d>
+                                <m:r>
+                                  <w:rPr>
+                                    <w:rFonts w:ascii="Cambria Math" w:hAnsi="Cambria Math"/>
+                                  </w:rPr>
+                                  <m:t>=</m:t>
+                                </m:r>
+                                <m:d>
+                                  <m:dPr>
+                                    <m:begChr m:val="{"/>
+                                    <m:endChr m:val=""/>
+                                    <m:ctrlPr>
+                                      <w:rPr>
+                                        <w:rFonts w:ascii="Cambria Math" w:hAnsi="Cambria Math"/>
+                                        <w:i/>
+                                      </w:rPr>
+                                    </m:ctrlPr>
+                                  </m:dPr>
+                                  <m:e>
+                                    <m:eqArr>
+                                      <m:eqArrPr>
+                                        <m:ctrlPr>
+                                          <w:rPr>
+                                            <w:rFonts w:ascii="Cambria Math" w:hAnsi="Cambria Math"/>
+                                            <w:i/>
+                                          </w:rPr>
+                                        </m:ctrlPr>
+                                      </m:eqArrPr>
+                                      <m:e>
+                                        <m:f>
+                                          <m:fPr>
+                                            <m:ctrlPr>
+                                              <w:rPr>
+                                                <w:rFonts w:ascii="Cambria Math" w:hAnsi="Cambria Math"/>
+                                                <w:i/>
+                                              </w:rPr>
+                                            </m:ctrlPr>
+                                          </m:fPr>
+                                          <m:num>
+                                            <m:r>
+                                              <w:rPr>
+                                                <w:rFonts w:ascii="Cambria Math" w:hAnsi="Cambria Math"/>
+                                              </w:rPr>
+                                              <m:t>2N</m:t>
+                                            </m:r>
+                                          </m:num>
+                                          <m:den>
+                                            <m:r>
+                                              <w:rPr>
+                                                <w:rFonts w:ascii="Cambria Math" w:hAnsi="Cambria Math"/>
+                                              </w:rPr>
+                                              <m:t>3M</m:t>
+                                            </m:r>
+                                          </m:den>
+                                        </m:f>
+                                        <m:r>
+                                          <w:rPr>
+                                            <w:rFonts w:ascii="Cambria Math" w:hAnsi="Cambria Math"/>
+                                          </w:rPr>
+                                          <m:t>, N≤1.5</m:t>
+                                        </m:r>
+                                        <m:r>
+                                          <w:rPr>
+                                            <w:rFonts w:ascii="Cambria Math" w:hAnsi="Cambria Math"/>
+                                          </w:rPr>
+                                          <m:t>M</m:t>
+                                        </m:r>
+                                      </m:e>
+                                      <m:e>
+                                        <m:r>
+                                          <w:rPr>
+                                            <w:rFonts w:ascii="Cambria Math" w:hAnsi="Cambria Math"/>
+                                          </w:rPr>
+                                          <m:t>1, N&gt;1.5</m:t>
+                                        </m:r>
+                                        <m:r>
+                                          <w:rPr>
+                                            <w:rFonts w:ascii="Cambria Math" w:hAnsi="Cambria Math"/>
+                                          </w:rPr>
+                                          <m:t>M</m:t>
+                                        </m:r>
+                                      </m:e>
+                                    </m:eqArr>
+                                  </m:e>
+                                </m:d>
+                              </m:oMath>
+                            </m:oMathPara>
+                          </w:p>
+                        </w:txbxContent>
+                      </wps:txbx>
+                      <wps:bodyPr rot="0" vert="horz" wrap="square" lIns="91440" tIns="45720" rIns="91440" bIns="45720" anchor="t" anchorCtr="0">
+                        <a:spAutoFit/>
+                      </wps:bodyPr>
+                    </wps:wsp>
+                  </a:graphicData>
+                </a:graphic>
+                <wp14:sizeRelH relativeFrom="margin">
+                  <wp14:pctWidth>0</wp14:pctWidth>
+                </wp14:sizeRelH>
+                <wp14:sizeRelV relativeFrom="margin">
+                  <wp14:pctHeight>20000</wp14:pctHeight>
+                </wp14:sizeRelV>
+              </wp:anchor>
+            </w:drawing>
+          </mc:Choice>
+          <mc:Fallback>
+            <w:pict>
+              <v:shapetype id="_x0000_t202" coordsize="21600,21600" o:spt="202" path="m,l,21600r21600,l21600,xe">
+                <v:stroke joinstyle="miter"/>
+                <v:path gradientshapeok="t" o:connecttype="rect"/>
+              </v:shapetype>
+              <v:shape id="_x0000_s1029" type="#_x0000_t202" style="position:absolute;left:0;text-align:left;margin-left:0;margin-top:.4pt;width:165.6pt;height:110.6pt;z-index:251665408;visibility:visible;mso-wrap-style:square;mso-width-percent:0;mso-height-percent:200;mso-wrap-distance-left:9pt;mso-wrap-distance-top:3.6pt;mso-wrap-distance-right:9pt;mso-wrap-distance-bottom:3.6pt;mso-position-horizontal:center;mso-position-horizontal-relative:margin;mso-position-vertical:absolute;mso-position-vertical-relative:text;mso-width-percent:0;mso-height-percent:200;mso-width-relative:margin;mso-height-relative:margin;v-text-anchor:top" o:gfxdata="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">
+                <v:textbox style="mso-fit-shape-to-text:t">
+                  <w:txbxContent>
+                    <w:p>
+                      <m:oMathPara>
+                        <m:oMath>
+                          <m:r>
+                            <w:rPr>
+                              <w:rFonts w:ascii="Cambria Math" w:hAnsi="Cambria Math"/>
+                            </w:rPr>
+                            <m:t>A=f</m:t>
+                          </m:r>
+                          <m:d>
+                            <m:dPr>
+                              <m:ctrlPr>
+                                <w:rPr>
+                                  <w:rFonts w:ascii="Cambria Math" w:hAnsi="Cambria Math"/>
+                                  <w:i/>
+                                </w:rPr>
+                              </m:ctrlPr>
+                            </m:dPr>
+                            <m:e>
+                              <m:r>
+                                <w:rPr>
+                                  <w:rFonts w:ascii="Cambria Math" w:hAnsi="Cambria Math"/>
+                                </w:rPr>
+                                <m:t>N,m</m:t>
+                              </m:r>
+                            </m:e>
+                          </m:d>
+                          <m:r>
+                            <w:rPr>
+                              <w:rFonts w:ascii="Cambria Math" w:hAnsi="Cambria Math"/>
+                            </w:rPr>
+                            <m:t>=</m:t>
+                          </m:r>
+                          <m:d>
+                            <m:dPr>
+                              <m:begChr m:val="{"/>
+                              <m:endChr m:val=""/>
+                              <m:ctrlPr>
+                                <w:rPr>
+                                  <w:rFonts w:ascii="Cambria Math" w:hAnsi="Cambria Math"/>
+                                  <w:i/>
+                                </w:rPr>
+                              </m:ctrlPr>
+                            </m:dPr>
+                            <m:e>
+                              <m:eqArr>
+                                <m:eqArrPr>
+                                  <m:ctrlPr>
+                                    <w:rPr>
+                                      <w:rFonts w:ascii="Cambria Math" w:hAnsi="Cambria Math"/>
+                                      <w:i/>
+                                    </w:rPr>
+                                  </m:ctrlPr>
+                                </m:eqArrPr>
+                                <m:e>
+                                  <m:f>
+                                    <m:fPr>
+                                      <m:ctrlPr>
+                                        <w:rPr>
+                                          <w:rFonts w:ascii="Cambria Math" w:hAnsi="Cambria Math"/>
+                                          <w:i/>
+                                        </w:rPr>
+                                      </m:ctrlPr>
+                                    </m:fPr>
+                                    <m:num>
+                                      <m:r>
+                                        <w:rPr>
+                                          <w:rFonts w:ascii="Cambria Math" w:hAnsi="Cambria Math"/>
+                                        </w:rPr>
+                                        <m:t>2N</m:t>
+                                      </m:r>
+                                    </m:num>
+                                    <m:den>
+                                      <m:r>
+                                        <w:rPr>
+                                          <w:rFonts w:ascii="Cambria Math" w:hAnsi="Cambria Math"/>
+                                        </w:rPr>
+                                        <m:t>3M</m:t>
+                                      </m:r>
+                                    </m:den>
+                                  </m:f>
+                                  <m:r>
+                                    <w:rPr>
+                                      <w:rFonts w:ascii="Cambria Math" w:hAnsi="Cambria Math"/>
+                                    </w:rPr>
+                                    <m:t>, N≤1.5</m:t>
+                                  </m:r>
+                                  <m:r>
+                                    <w:rPr>
+                                      <w:rFonts w:ascii="Cambria Math" w:hAnsi="Cambria Math"/>
+                                    </w:rPr>
+                                    <m:t>M</m:t>
+                                  </m:r>
+                                </m:e>
+                                <m:e>
+                                  <m:r>
+                                    <w:rPr>
+                                      <w:rFonts w:ascii="Cambria Math" w:hAnsi="Cambria Math"/>
+                                    </w:rPr>
+                                    <m:t>1, N&gt;1.5</m:t>
+                                  </m:r>
+                                  <m:r>
+                                    <w:rPr>
+                                      <w:rFonts w:ascii="Cambria Math" w:hAnsi="Cambria Math"/>
+                                    </w:rPr>
+                                    <m:t>M</m:t>
+                                  </m:r>
+                                </m:e>
+                              </m:eqArr>
+                            </m:e>
+                          </m:d>
+                        </m:oMath>
+                      </m:oMathPara>
+                    </w:p>
+                  </w:txbxContent>
+                </v:textbox>
+                <w10:wrap type="square" anchorx="margin"/>
+              </v:shape>
+            </w:pict>
+          </mc:Fallback>
+        </mc:AlternateContent>
+      </w:r>
+    </w:p>
+    <w:p>
+      <w:pPr>
+        <w:pStyle w:val="ListParagraph"/>
+      </w:pPr>
+    </w:p>
+    <w:p>
+      <w:pPr>
+        <w:pStyle w:val="ListParagraph"/>
+      </w:pPr>
+    </w:p>
+    <w:p>
+      <w:pPr>
+        <w:pStyle w:val="ListParagraph"/>
+      </w:pPr>
+    </w:p>
+    <w:p>
+      <w:pPr>
+        <w:pStyle w:val="ListParagraph"/>
+      </w:pPr>
+    </w:p>
+    <w:p>
+      <w:pPr>
+        <w:pStyle w:val="ListParagraph"/>
+        <w:rPr>
+          <w:rFonts w:eastAsiaTheme="minorEastAsia"/>
+        </w:rPr>
+      </w:pPr>
+      <m:oMathPara>
+        <m:oMath>
+          <m:r>
+            <w:rPr>
+              <w:rFonts w:ascii="Cambria Math" w:hAnsi="Cambria Math"/>
+            </w:rPr>
+            <m:t>f:R→[0,1]</m:t>
+          </m:r>
+        </m:oMath>
+      </m:oMathPara>
+    </w:p>
+    <w:p/>
+    <w:p>
+      <w:pPr>
+        <w:pStyle w:val="ListParagraph"/>
+        <w:numPr>
+          <w:ilvl w:val="0"/>
+          <w:numId w:val="2"/>
+        </w:numPr>
+      </w:pPr>
+      <w:r>
+        <w:rPr>
+          <w:b/>
+        </w:rPr>
+        <w:t xml:space="preserve">Cohesion (C) – Defined for </w:t>
+      </w:r>
+      <w:proofErr w:type="spellStart"/>
+      <w:r>
+        <w:rPr>
+          <w:b/>
+        </w:rPr>
+        <w:t>solars</w:t>
+      </w:r>
+      <w:proofErr w:type="spellEnd"/>
+    </w:p>
+    <w:p>
+      <w:pPr>
+        <w:pStyle w:val="ListParagraph"/>
+      </w:pPr>
+    </w:p>
+    <w:p>
+      <w:pPr>
+        <w:pStyle w:val="ListParagraph"/>
+      </w:pPr>
+      <w:r>
+        <w:t>Cohesion is a measure of interactivity between a pair of people in a group chat.</w:t>
+      </w:r>
+    </w:p>
+    <w:p>
+      <w:pPr>
+        <w:pStyle w:val="ListParagraph"/>
+      </w:pPr>
+    </w:p>
+    <w:p>
+      <w:pPr>
+        <w:pStyle w:val="ListParagraph"/>
+        <w:rPr>
+          <w:rFonts w:eastAsiaTheme="minorEastAsia"/>
+        </w:rPr>
+      </w:pPr>
+      <w:r>
+        <w:t xml:space="preserve">Function receives a list of elements like </w:t>
+      </w:r>
+      <m:oMath>
+        <m:d>
+          <m:dPr>
+            <m:ctrlPr>
+              <w:rPr>
+                <w:rFonts w:ascii="Cambria Math" w:hAnsi="Cambria Math"/>
+                <w:i/>
+              </w:rPr>
+            </m:ctrlPr>
+          </m:dPr>
+          <m:e>
+            <m:sSub>
+              <m:sSubPr>
+                <m:ctrlPr>
+                  <w:rPr>
+                    <w:rFonts w:ascii="Cambria Math" w:hAnsi="Cambria Math"/>
+                    <w:i/>
+                  </w:rPr>
+                </m:ctrlPr>
+              </m:sSubPr>
+              <m:e>
+                <m:r>
+                  <w:rPr>
+                    <w:rFonts w:ascii="Cambria Math" w:hAnsi="Cambria Math"/>
+                  </w:rPr>
+                  <m:t>u</m:t>
+                </m:r>
+              </m:e>
+              <m:sub>
+                <m:r>
+                  <w:rPr>
+                    <w:rFonts w:ascii="Cambria Math" w:hAnsi="Cambria Math"/>
+                  </w:rPr>
+                  <m:t>a</m:t>
+                </m:r>
+              </m:sub>
+            </m:sSub>
+            <m:r>
+              <w:rPr>
+                <w:rFonts w:ascii="Cambria Math" w:hAnsi="Cambria Math"/>
+              </w:rPr>
+              <m:t xml:space="preserve">, </m:t>
+            </m:r>
+            <m:sSub>
+              <m:sSubPr>
+                <m:ctrlPr>
+                  <w:rPr>
+                    <w:rFonts w:ascii="Cambria Math" w:hAnsi="Cambria Math"/>
+                    <w:i/>
+                  </w:rPr>
+                </m:ctrlPr>
+              </m:sSubPr>
+              <m:e>
+                <m:r>
+                  <w:rPr>
+                    <w:rFonts w:ascii="Cambria Math" w:hAnsi="Cambria Math"/>
+                  </w:rPr>
+                  <m:t>u</m:t>
+                </m:r>
+              </m:e>
+              <m:sub>
+                <m:r>
+                  <w:rPr>
+                    <w:rFonts w:ascii="Cambria Math" w:hAnsi="Cambria Math"/>
+                  </w:rPr>
+                  <m:t>b</m:t>
+                </m:r>
+              </m:sub>
+            </m:sSub>
+            <m:r>
+              <w:rPr>
+                <w:rFonts w:ascii="Cambria Math" w:hAnsi="Cambria Math"/>
+              </w:rPr>
+              <m:t>, n</m:t>
+            </m:r>
+          </m:e>
+        </m:d>
+      </m:oMath>
+      <w:r>
+        <w:rPr>
+          <w:rFonts w:eastAsiaTheme="minorEastAsia"/>
+        </w:rPr>
+        <w:t xml:space="preserve"> where </w:t>
+      </w:r>
+      <m:oMath>
+        <m:r>
+          <w:rPr>
+            <w:rFonts w:ascii="Cambria Math" w:eastAsiaTheme="minorEastAsia" w:hAnsi="Cambria Math"/>
+          </w:rPr>
+          <m:t>n</m:t>
+        </m:r>
+      </m:oMath>
+      <w:r>
+        <w:rPr>
+          <w:rFonts w:eastAsiaTheme="minorEastAsia"/>
+        </w:rPr>
+        <w:t xml:space="preserve"> are the replies sent by person a to person b plus vice-versa. It sorts the elements in ascending order with respect to </w:t>
+      </w:r>
+      <m:oMath>
+        <m:r>
+          <w:rPr>
+            <w:rFonts w:ascii="Cambria Math" w:eastAsiaTheme="minorEastAsia" w:hAnsi="Cambria Math"/>
+          </w:rPr>
+          <m:t>n</m:t>
+        </m:r>
+      </m:oMath>
+      <w:r>
+        <w:rPr>
+          <w:rFonts w:eastAsiaTheme="minorEastAsia"/>
+        </w:rPr>
+        <w:t xml:space="preserve"> and then</w:t>
+      </w:r>
+      <w:r>
+        <w:rPr>
+          <w:rFonts w:eastAsiaTheme="minorEastAsia"/>
+        </w:rPr>
+        <w:t xml:space="preserve"> get </w:t>
+      </w:r>
+      <m:oMath>
+        <m:sSub>
+          <m:sSubPr>
+            <m:ctrlPr>
+              <w:rPr>
+                <w:rFonts w:ascii="Cambria Math" w:eastAsiaTheme="minorEastAsia" w:hAnsi="Cambria Math"/>
+                <w:i/>
+              </w:rPr>
+            </m:ctrlPr>
+          </m:sSubPr>
+          <m:e>
+            <m:r>
+              <w:rPr>
+                <w:rFonts w:ascii="Cambria Math" w:eastAsiaTheme="minorEastAsia" w:hAnsi="Cambria Math"/>
+              </w:rPr>
+              <m:t>n</m:t>
+            </m:r>
+          </m:e>
+          <m:sub>
+            <m:r>
+              <w:rPr>
+                <w:rFonts w:ascii="Cambria Math" w:eastAsiaTheme="minorEastAsia" w:hAnsi="Cambria Math"/>
+              </w:rPr>
+              <m:t>min</m:t>
+            </m:r>
+          </m:sub>
+        </m:sSub>
+      </m:oMath>
+      <w:r>
+        <w:rPr>
+          <w:rFonts w:eastAsiaTheme="minorEastAsia"/>
+        </w:rPr>
+        <w:t xml:space="preserve"> and </w:t>
+      </w:r>
+      <m:oMath>
+        <m:sSub>
+          <m:sSubPr>
+            <m:ctrlPr>
+              <w:rPr>
+                <w:rFonts w:ascii="Cambria Math" w:eastAsiaTheme="minorEastAsia" w:hAnsi="Cambria Math"/>
+                <w:i/>
+              </w:rPr>
+            </m:ctrlPr>
+          </m:sSubPr>
+          <m:e>
+            <m:r>
+              <w:rPr>
+                <w:rFonts w:ascii="Cambria Math" w:eastAsiaTheme="minorEastAsia" w:hAnsi="Cambria Math"/>
+              </w:rPr>
+              <m:t>n</m:t>
+            </m:r>
+          </m:e>
+          <m:sub>
+            <m:r>
+              <w:rPr>
+                <w:rFonts w:ascii="Cambria Math" w:eastAsiaTheme="minorEastAsia" w:hAnsi="Cambria Math"/>
+              </w:rPr>
+              <m:t>max</m:t>
+            </m:r>
+          </m:sub>
+        </m:sSub>
+      </m:oMath>
+      <w:r>
+        <w:rPr>
+          <w:rFonts w:eastAsiaTheme="minorEastAsia"/>
+        </w:rPr>
+        <w:t xml:space="preserve"> .</w:t>
+      </w:r>
+      <w:r>
+        <w:rPr>
+          <w:rFonts w:eastAsiaTheme="minorEastAsia"/>
+        </w:rPr>
+        <w:t xml:space="preserve"> Now we calculate </w:t>
+      </w:r>
+      <m:oMath>
+        <m:sSub>
+          <m:sSubPr>
+            <m:ctrlPr>
+              <w:rPr>
+                <w:rFonts w:ascii="Cambria Math" w:eastAsiaTheme="minorEastAsia" w:hAnsi="Cambria Math"/>
+                <w:i/>
+              </w:rPr>
+            </m:ctrlPr>
+          </m:sSubPr>
+          <m:e>
+            <m:r>
+              <w:rPr>
+                <w:rFonts w:ascii="Cambria Math" w:eastAsiaTheme="minorEastAsia" w:hAnsi="Cambria Math"/>
+              </w:rPr>
+              <m:t>C</m:t>
+            </m:r>
+          </m:e>
+          <m:sub>
+            <m:r>
+              <w:rPr>
+                <w:rFonts w:ascii="Cambria Math" w:eastAsiaTheme="minorEastAsia" w:hAnsi="Cambria Math"/>
+              </w:rPr>
+              <m:t>i</m:t>
+            </m:r>
+          </m:sub>
+        </m:sSub>
+      </m:oMath>
+      <w:r>
+        <w:rPr>
+          <w:rFonts w:eastAsiaTheme="minorEastAsia"/>
+        </w:rPr>
+        <w:t xml:space="preserve"> and return a list of elements like </w:t>
+      </w:r>
+      <m:oMath>
+        <m:d>
+          <m:dPr>
+            <m:ctrlPr>
+              <w:rPr>
+                <w:rFonts w:ascii="Cambria Math" w:eastAsiaTheme="minorEastAsia" w:hAnsi="Cambria Math"/>
+                <w:i/>
+              </w:rPr>
+            </m:ctrlPr>
+          </m:dPr>
+          <m:e>
+            <m:sSub>
+              <m:sSubPr>
+                <m:ctrlPr>
+                  <w:rPr>
+                    <w:rFonts w:ascii="Cambria Math" w:eastAsiaTheme="minorEastAsia" w:hAnsi="Cambria Math"/>
+                    <w:i/>
+                  </w:rPr>
+                </m:ctrlPr>
+              </m:sSubPr>
+              <m:e>
+                <m:r>
+                  <w:rPr>
+                    <w:rFonts w:ascii="Cambria Math" w:eastAsiaTheme="minorEastAsia" w:hAnsi="Cambria Math"/>
+                  </w:rPr>
+                  <m:t>u</m:t>
+                </m:r>
+              </m:e>
+              <m:sub>
+                <m:r>
+                  <w:rPr>
+                    <w:rFonts w:ascii="Cambria Math" w:eastAsiaTheme="minorEastAsia" w:hAnsi="Cambria Math"/>
+                  </w:rPr>
+                  <m:t>a</m:t>
+                </m:r>
+              </m:sub>
+            </m:sSub>
+            <m:r>
+              <w:rPr>
+                <w:rFonts w:ascii="Cambria Math" w:eastAsiaTheme="minorEastAsia" w:hAnsi="Cambria Math"/>
+              </w:rPr>
+              <m:t xml:space="preserve">, </m:t>
+            </m:r>
+            <m:sSub>
+              <m:sSubPr>
+                <m:ctrlPr>
+                  <w:rPr>
+                    <w:rFonts w:ascii="Cambria Math" w:eastAsiaTheme="minorEastAsia" w:hAnsi="Cambria Math"/>
+                    <w:i/>
+                  </w:rPr>
+                </m:ctrlPr>
+              </m:sSubPr>
+              <m:e>
+                <m:r>
+                  <w:rPr>
+                    <w:rFonts w:ascii="Cambria Math" w:eastAsiaTheme="minorEastAsia" w:hAnsi="Cambria Math"/>
+                  </w:rPr>
+                  <m:t>u</m:t>
+                </m:r>
+              </m:e>
+              <m:sub>
+                <m:r>
+                  <w:rPr>
+                    <w:rFonts w:ascii="Cambria Math" w:eastAsiaTheme="minorEastAsia" w:hAnsi="Cambria Math"/>
+                  </w:rPr>
+                  <m:t>b</m:t>
+                </m:r>
+              </m:sub>
+            </m:sSub>
+            <m:r>
+              <w:rPr>
+                <w:rFonts w:ascii="Cambria Math" w:eastAsiaTheme="minorEastAsia" w:hAnsi="Cambria Math"/>
+              </w:rPr>
+              <m:t xml:space="preserve">, </m:t>
+            </m:r>
+            <m:sSub>
+              <m:sSubPr>
+                <m:ctrlPr>
+                  <w:rPr>
+                    <w:rFonts w:ascii="Cambria Math" w:eastAsiaTheme="minorEastAsia" w:hAnsi="Cambria Math"/>
+                    <w:i/>
+                  </w:rPr>
+                </m:ctrlPr>
+              </m:sSubPr>
+              <m:e>
+                <m:r>
+                  <w:rPr>
+                    <w:rFonts w:ascii="Cambria Math" w:eastAsiaTheme="minorEastAsia" w:hAnsi="Cambria Math"/>
+                  </w:rPr>
+                  <m:t>C</m:t>
+                </m:r>
+              </m:e>
+              <m:sub>
+                <m:r>
+                  <w:rPr>
+                    <w:rFonts w:ascii="Cambria Math" w:eastAsiaTheme="minorEastAsia" w:hAnsi="Cambria Math"/>
+                  </w:rPr>
+                  <m:t>ab</m:t>
+                </m:r>
+              </m:sub>
+            </m:sSub>
+          </m:e>
+        </m:d>
+      </m:oMath>
+      <w:r>
+        <w:rPr>
+          <w:rFonts w:eastAsiaTheme="minorEastAsia"/>
+        </w:rPr>
+        <w:t>.</w:t>
+      </w:r>
+      <w:r>
+        <w:rPr>
+          <w:rFonts w:eastAsiaTheme="minorEastAsia"/>
+        </w:rPr>
+        <w:t xml:space="preserve"> In case </w:t>
+      </w:r>
+      <m:oMath>
+        <m:sSub>
+          <m:sSubPr>
+            <m:ctrlPr>
+              <w:rPr>
+                <w:rFonts w:ascii="Cambria Math" w:eastAsiaTheme="minorEastAsia" w:hAnsi="Cambria Math"/>
+                <w:i/>
+              </w:rPr>
+            </m:ctrlPr>
+          </m:sSubPr>
+          <m:e>
+            <m:r>
+              <w:rPr>
+                <w:rFonts w:ascii="Cambria Math" w:eastAsiaTheme="minorEastAsia" w:hAnsi="Cambria Math"/>
+              </w:rPr>
+              <m:t>n</m:t>
+            </m:r>
+          </m:e>
+          <m:sub>
+            <m:r>
+              <w:rPr>
+                <w:rFonts w:ascii="Cambria Math" w:eastAsiaTheme="minorEastAsia" w:hAnsi="Cambria Math"/>
+              </w:rPr>
+              <m:t>min</m:t>
+            </m:r>
+          </m:sub>
+        </m:sSub>
+      </m:oMath>
+      <w:r>
+        <w:rPr>
+          <w:rFonts w:eastAsiaTheme="minorEastAsia"/>
+        </w:rPr>
+        <w:t xml:space="preserve"> is zero, it reroutes to the nearest non-zero </w:t>
+      </w:r>
+      <m:oMath>
+        <m:sSub>
+          <m:sSubPr>
+            <m:ctrlPr>
+              <w:rPr>
+                <w:rFonts w:ascii="Cambria Math" w:eastAsiaTheme="minorEastAsia" w:hAnsi="Cambria Math"/>
+                <w:i/>
+              </w:rPr>
+            </m:ctrlPr>
+          </m:sSubPr>
+          <m:e>
+            <m:r>
+              <w:rPr>
+                <w:rFonts w:ascii="Cambria Math" w:eastAsiaTheme="minorEastAsia" w:hAnsi="Cambria Math"/>
+              </w:rPr>
+              <m:t>n</m:t>
+            </m:r>
+          </m:e>
+          <m:sub>
+            <m:r>
+              <w:rPr>
+                <w:rFonts w:ascii="Cambria Math" w:eastAsiaTheme="minorEastAsia" w:hAnsi="Cambria Math"/>
+              </w:rPr>
+              <m:t>min</m:t>
+            </m:r>
+          </m:sub>
+        </m:sSub>
+      </m:oMath>
+      <w:r>
+        <w:rPr>
+          <w:rFonts w:eastAsiaTheme="minorEastAsia"/>
+        </w:rPr>
+        <w:t xml:space="preserve">. If </w:t>
+      </w:r>
+      <m:oMath>
+        <m:sSub>
+          <m:sSubPr>
+            <m:ctrlPr>
+              <w:rPr>
+                <w:rFonts w:ascii="Cambria Math" w:eastAsiaTheme="minorEastAsia" w:hAnsi="Cambria Math"/>
+                <w:i/>
+              </w:rPr>
+            </m:ctrlPr>
+          </m:sSubPr>
+          <m:e>
+            <m:r>
+              <w:rPr>
+                <w:rFonts w:ascii="Cambria Math" w:eastAsiaTheme="minorEastAsia" w:hAnsi="Cambria Math"/>
+              </w:rPr>
+              <m:t>n</m:t>
+            </m:r>
+          </m:e>
+          <m:sub>
+            <m:r>
+              <w:rPr>
+                <w:rFonts w:ascii="Cambria Math" w:eastAsiaTheme="minorEastAsia" w:hAnsi="Cambria Math"/>
+              </w:rPr>
+              <m:t>max</m:t>
+            </m:r>
+          </m:sub>
+        </m:sSub>
+        <m:r>
+          <w:rPr>
+            <w:rFonts w:ascii="Cambria Math" w:eastAsiaTheme="minorEastAsia" w:hAnsi="Cambria Math"/>
+          </w:rPr>
+          <m:t>=0</m:t>
+        </m:r>
+      </m:oMath>
+      <w:r>
+        <w:rPr>
+          <w:rFonts w:eastAsiaTheme="minorEastAsia"/>
+        </w:rPr>
+        <w:t xml:space="preserve"> , </w:t>
+      </w:r>
+      <m:oMath>
+        <m:r>
+          <w:rPr>
+            <w:rFonts w:ascii="Cambria Math" w:eastAsiaTheme="minorEastAsia" w:hAnsi="Cambria Math"/>
+          </w:rPr>
+          <m:t>C</m:t>
+        </m:r>
+      </m:oMath>
+      <w:r>
+        <w:rPr>
+          <w:rFonts w:eastAsiaTheme="minorEastAsia"/>
+        </w:rPr>
+        <w:t xml:space="preserve"> doesn’t exist.</w:t>
+      </w:r>
+    </w:p>
+    <w:p>
+      <w:pPr>
+        <w:pStyle w:val="ListParagraph"/>
+        <w:rPr>
+          <w:rFonts w:eastAsiaTheme="minorEastAsia"/>
+        </w:rPr>
+      </w:pPr>
+      <w:r>
+        <w:rPr>
+          <w:rFonts w:eastAsiaTheme="minorEastAsia"/>
+          <w:noProof/>
+        </w:rPr>
+        <mc:AlternateContent>
+          <mc:Choice Requires="wps">
+            <w:drawing>
+              <wp:anchor distT="45720" distB="45720" distL="114300" distR="114300" simplePos="0" relativeHeight="251667456" behindDoc="0" locked="0" layoutInCell="1" allowOverlap="1">
+                <wp:simplePos x="0" y="0"/>
+                <wp:positionH relativeFrom="margin">
+                  <wp:align>center</wp:align>
+                </wp:positionH>
+                <wp:positionV relativeFrom="paragraph">
+                  <wp:posOffset>182245</wp:posOffset>
+                </wp:positionV>
+                <wp:extent cx="1722120" cy="731520"/>
+                <wp:effectExtent l="0" t="0" r="11430" b="11430"/>
+                <wp:wrapSquare wrapText="bothSides"/>
+                <wp:docPr id="4" name="Text Box 2"/>
+                <wp:cNvGraphicFramePr>
+                  <a:graphicFrameLocks xmlns:a="http://schemas.openxmlformats.org/drawingml/2006/main"/>
+                </wp:cNvGraphicFramePr>
+                <a:graphic xmlns:a="http://schemas.openxmlformats.org/drawingml/2006/main">
+                  <a:graphicData uri="http://schemas.microsoft.com/office/word/2010/wordprocessingShape">
+                    <wps:wsp>
+                      <wps:cNvSpPr txBox="1">
+                        <a:spLocks noChangeArrowheads="1"/>
+                      </wps:cNvSpPr>
+                      <wps:spPr bwMode="auto">
+                        <a:xfrm>
+                          <a:off x="0" y="0"/>
+                          <a:ext cx="1722120" cy="731520"/>
+                        </a:xfrm>
+                        <a:prstGeom prst="rect">
+                          <a:avLst/>
+                        </a:prstGeom>
+                        <a:solidFill>
+                          <a:srgbClr val="FFFFFF"/>
+                        </a:solidFill>
+                        <a:ln w="9525">
+                          <a:solidFill>
+                            <a:srgbClr val="000000"/>
+                          </a:solidFill>
+                          <a:miter lim="800000"/>
+                          <a:headEnd/>
+                          <a:tailEnd/>
+                        </a:ln>
+                      </wps:spPr>
+                      <wps:txbx>
+                        <w:txbxContent>
+                          <w:p>
+                            <m:oMathPara>
+                              <m:oMath>
+                                <m:sSub>
+                                  <m:sSubPr>
+                                    <m:ctrlPr>
+                                      <w:rPr>
+                                        <w:rFonts w:ascii="Cambria Math" w:hAnsi="Cambria Math"/>
+                                        <w:i/>
+                                      </w:rPr>
+                                    </m:ctrlPr>
+                                  </m:sSubPr>
+                                  <m:e>
+                                    <m:r>
+                                      <w:rPr>
+                                        <w:rFonts w:ascii="Cambria Math" w:hAnsi="Cambria Math"/>
+                                      </w:rPr>
+                                      <m:t>C</m:t>
+                                    </m:r>
+                                  </m:e>
+                                  <m:sub>
+                                    <m:r>
+                                      <w:rPr>
+                                        <w:rFonts w:ascii="Cambria Math" w:hAnsi="Cambria Math"/>
+                                      </w:rPr>
+                                      <m:t>i</m:t>
+                                    </m:r>
+                                  </m:sub>
+                                </m:sSub>
+                                <m:r>
+                                  <w:rPr>
+                                    <w:rFonts w:ascii="Cambria Math" w:hAnsi="Cambria Math"/>
+                                  </w:rPr>
+                                  <m:t>=f</m:t>
+                                </m:r>
+                                <m:d>
+                                  <m:dPr>
+                                    <m:ctrlPr>
+                                      <w:rPr>
+                                        <w:rFonts w:ascii="Cambria Math" w:hAnsi="Cambria Math"/>
+                                        <w:i/>
+                                      </w:rPr>
+                                    </m:ctrlPr>
+                                  </m:dPr>
+                                  <m:e>
+                                    <m:r>
+                                      <w:rPr>
+                                        <w:rFonts w:ascii="Cambria Math" w:hAnsi="Cambria Math"/>
+                                      </w:rPr>
+                                      <m:t>i</m:t>
+                                    </m:r>
+                                  </m:e>
+                                </m:d>
+                                <m:r>
+                                  <w:rPr>
+                                    <w:rFonts w:ascii="Cambria Math" w:hAnsi="Cambria Math"/>
+                                  </w:rPr>
+                                  <m:t>=</m:t>
+                                </m:r>
+                                <m:f>
+                                  <m:fPr>
+                                    <m:ctrlPr>
+                                      <w:rPr>
+                                        <w:rFonts w:ascii="Cambria Math" w:hAnsi="Cambria Math"/>
+                                        <w:i/>
+                                      </w:rPr>
+                                    </m:ctrlPr>
+                                  </m:fPr>
+                                  <m:num>
+                                    <m:func>
+                                      <m:funcPr>
+                                        <m:ctrlPr>
+                                          <w:rPr>
+                                            <w:rFonts w:ascii="Cambria Math" w:hAnsi="Cambria Math"/>
+                                            <w:i/>
+                                          </w:rPr>
+                                        </m:ctrlPr>
+                                      </m:funcPr>
+                                      <m:fName>
+                                        <m:r>
+                                          <m:rPr>
+                                            <m:sty m:val="p"/>
+                                          </m:rPr>
+                                          <w:rPr>
+                                            <w:rFonts w:ascii="Cambria Math" w:hAnsi="Cambria Math"/>
+                                          </w:rPr>
+                                          <m:t>log</m:t>
+                                        </m:r>
+                                      </m:fName>
+                                      <m:e>
+                                        <m:d>
+                                          <m:dPr>
+                                            <m:ctrlPr>
+                                              <w:rPr>
+                                                <w:rFonts w:ascii="Cambria Math" w:hAnsi="Cambria Math"/>
+                                                <w:i/>
+                                              </w:rPr>
+                                            </m:ctrlPr>
+                                          </m:dPr>
+                                          <m:e>
+                                            <m:f>
+                                              <m:fPr>
+                                                <m:ctrlPr>
+                                                  <w:rPr>
+                                                    <w:rFonts w:ascii="Cambria Math" w:hAnsi="Cambria Math"/>
+                                                    <w:i/>
+                                                  </w:rPr>
+                                                </m:ctrlPr>
+                                              </m:fPr>
+                                              <m:num>
+                                                <m:r>
+                                                  <w:rPr>
+                                                    <w:rFonts w:ascii="Cambria Math" w:hAnsi="Cambria Math"/>
+                                                  </w:rPr>
+                                                  <m:t>i</m:t>
+                                                </m:r>
+                                              </m:num>
+                                              <m:den>
+                                                <m:sSub>
+                                                  <m:sSubPr>
+                                                    <m:ctrlPr>
+                                                      <w:rPr>
+                                                        <w:rFonts w:ascii="Cambria Math" w:hAnsi="Cambria Math"/>
+                                                        <w:i/>
+                                                      </w:rPr>
+                                                    </m:ctrlPr>
+                                                  </m:sSubPr>
+                                                  <m:e>
+                                                    <m:r>
+                                                      <w:rPr>
+                                                        <w:rFonts w:ascii="Cambria Math" w:hAnsi="Cambria Math"/>
+                                                      </w:rPr>
+                                                      <m:t>n</m:t>
+                                                    </m:r>
+                                                  </m:e>
+                                                  <m:sub>
+                                                    <m:r>
+                                                      <w:rPr>
+                                                        <w:rFonts w:ascii="Cambria Math" w:hAnsi="Cambria Math"/>
+                                                      </w:rPr>
+                                                      <m:t>min</m:t>
+                                                    </m:r>
+                                                  </m:sub>
+                                                </m:sSub>
+                                              </m:den>
+                                            </m:f>
+                                          </m:e>
+                                        </m:d>
+                                      </m:e>
+                                    </m:func>
+                                  </m:num>
+                                  <m:den>
+                                    <m:func>
+                                      <m:funcPr>
+                                        <m:ctrlPr>
+                                          <w:rPr>
+                                            <w:rFonts w:ascii="Cambria Math" w:hAnsi="Cambria Math"/>
+                                            <w:i/>
+                                          </w:rPr>
+                                        </m:ctrlPr>
+                                      </m:funcPr>
+                                      <m:fName>
+                                        <m:r>
+                                          <m:rPr>
+                                            <m:sty m:val="p"/>
+                                          </m:rPr>
+                                          <w:rPr>
+                                            <w:rFonts w:ascii="Cambria Math" w:hAnsi="Cambria Math"/>
+                                          </w:rPr>
+                                          <m:t>log</m:t>
+                                        </m:r>
+                                      </m:fName>
+                                      <m:e>
+                                        <m:d>
+                                          <m:dPr>
+                                            <m:ctrlPr>
+                                              <w:rPr>
+                                                <w:rFonts w:ascii="Cambria Math" w:hAnsi="Cambria Math"/>
+                                                <w:i/>
+                                              </w:rPr>
+                                            </m:ctrlPr>
+                                          </m:dPr>
+                                          <m:e>
+                                            <m:f>
+                                              <m:fPr>
+                                                <m:ctrlPr>
+                                                  <w:rPr>
+                                                    <w:rFonts w:ascii="Cambria Math" w:hAnsi="Cambria Math"/>
+                                                    <w:i/>
+                                                  </w:rPr>
+                                                </m:ctrlPr>
+                                              </m:fPr>
+                                              <m:num>
+                                                <m:sSub>
+                                                  <m:sSubPr>
+                                                    <m:ctrlPr>
+                                                      <w:rPr>
+                                                        <w:rFonts w:ascii="Cambria Math" w:hAnsi="Cambria Math"/>
+                                                        <w:i/>
+                                                      </w:rPr>
+                                                    </m:ctrlPr>
+                                                  </m:sSubPr>
+                                                  <m:e>
+                                                    <m:r>
+                                                      <w:rPr>
+                                                        <w:rFonts w:ascii="Cambria Math" w:hAnsi="Cambria Math"/>
+                                                      </w:rPr>
+                                                      <m:t>n</m:t>
+                                                    </m:r>
+                                                  </m:e>
+                                                  <m:sub>
+                                                    <m:r>
+                                                      <w:rPr>
+                                                        <w:rFonts w:ascii="Cambria Math" w:hAnsi="Cambria Math"/>
+                                                      </w:rPr>
+                                                      <m:t>max</m:t>
+                                                    </m:r>
+                                                  </m:sub>
+                                                </m:sSub>
+                                              </m:num>
+                                              <m:den>
+                                                <m:sSub>
+                                                  <m:sSubPr>
+                                                    <m:ctrlPr>
+                                                      <w:rPr>
+                                                        <w:rFonts w:ascii="Cambria Math" w:hAnsi="Cambria Math"/>
+                                                        <w:i/>
+                                                      </w:rPr>
+                                                    </m:ctrlPr>
+                                                  </m:sSubPr>
+                                                  <m:e>
+                                                    <m:r>
+                                                      <w:rPr>
+                                                        <w:rFonts w:ascii="Cambria Math" w:hAnsi="Cambria Math"/>
+                                                      </w:rPr>
+                                                      <m:t>n</m:t>
+                                                    </m:r>
+                                                  </m:e>
+                                                  <m:sub>
+                                                    <m:r>
+                                                      <w:rPr>
+                                                        <w:rFonts w:ascii="Cambria Math" w:hAnsi="Cambria Math"/>
+                                                      </w:rPr>
+                                                      <m:t>min</m:t>
+                                                    </m:r>
+                                                  </m:sub>
+                                                </m:sSub>
+                                              </m:den>
+                                            </m:f>
+                                          </m:e>
+                                        </m:d>
+                                      </m:e>
+                                    </m:func>
+                                  </m:den>
+                                </m:f>
+                              </m:oMath>
+                            </m:oMathPara>
+                          </w:p>
+                        </w:txbxContent>
+                      </wps:txbx>
+                      <wps:bodyPr rot="0" vert="horz" wrap="square" lIns="91440" tIns="45720" rIns="91440" bIns="45720" anchor="t" anchorCtr="0">
+                        <a:noAutofit/>
+                      </wps:bodyPr>
+                    </wps:wsp>
+                  </a:graphicData>
+                </a:graphic>
+                <wp14:sizeRelH relativeFrom="margin">
+                  <wp14:pctWidth>0</wp14:pctWidth>
+                </wp14:sizeRelH>
+                <wp14:sizeRelV relativeFrom="margin">
+                  <wp14:pctHeight>0</wp14:pctHeight>
+                </wp14:sizeRelV>
+              </wp:anchor>
+            </w:drawing>
+          </mc:Choice>
+          <mc:Fallback>
+            <w:pict>
+              <v:shape id="_x0000_s1030" type="#_x0000_t202" style="position:absolute;left:0;text-align:left;margin-left:0;margin-top:14.35pt;width:135.6pt;height:57.6pt;z-index:251667456;visibility:visible;mso-wrap-style:square;mso-width-percent:0;mso-height-percent:0;mso-wrap-distance-left:9pt;mso-wrap-distance-top:3.6pt;mso-wrap-distance-right:9pt;mso-wrap-distance-bottom:3.6pt;mso-position-horizontal:center;mso-position-horizontal-relative:margin;mso-position-vertical:absolute;mso-position-vertical-relative:text;mso-width-percent:0;mso-height-percent:0;mso-width-relative:margin;mso-height-relative:margin;v-text-anchor:top" o:gfxdata="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">
+                <v:textbox>
+                  <w:txbxContent>
+                    <w:p>
+                      <m:oMathPara>
+                        <m:oMath>
+                          <m:sSub>
+                            <m:sSubPr>
+                              <m:ctrlPr>
+                                <w:rPr>
+                                  <w:rFonts w:ascii="Cambria Math" w:hAnsi="Cambria Math"/>
+                                  <w:i/>
+                                </w:rPr>
+                              </m:ctrlPr>
+                            </m:sSubPr>
+                            <m:e>
+                              <m:r>
+                                <w:rPr>
+                                  <w:rFonts w:ascii="Cambria Math" w:hAnsi="Cambria Math"/>
+                                </w:rPr>
+                                <m:t>C</m:t>
+                              </m:r>
+                            </m:e>
+                            <m:sub>
+                              <m:r>
+                                <w:rPr>
+                                  <w:rFonts w:ascii="Cambria Math" w:hAnsi="Cambria Math"/>
+                                </w:rPr>
+                                <m:t>i</m:t>
+                              </m:r>
+                            </m:sub>
+                          </m:sSub>
+                          <m:r>
+                            <w:rPr>
+                              <w:rFonts w:ascii="Cambria Math" w:hAnsi="Cambria Math"/>
+                            </w:rPr>
+                            <m:t>=f</m:t>
+                          </m:r>
+                          <m:d>
+                            <m:dPr>
+                              <m:ctrlPr>
+                                <w:rPr>
+                                  <w:rFonts w:ascii="Cambria Math" w:hAnsi="Cambria Math"/>
+                                  <w:i/>
+                                </w:rPr>
+                              </m:ctrlPr>
+                            </m:dPr>
+                            <m:e>
+                              <m:r>
+                                <w:rPr>
+                                  <w:rFonts w:ascii="Cambria Math" w:hAnsi="Cambria Math"/>
+                                </w:rPr>
+                                <m:t>i</m:t>
+                              </m:r>
+                            </m:e>
+                          </m:d>
+                          <m:r>
+                            <w:rPr>
+                              <w:rFonts w:ascii="Cambria Math" w:hAnsi="Cambria Math"/>
+                            </w:rPr>
+                            <m:t>=</m:t>
+                          </m:r>
+                          <m:f>
+                            <m:fPr>
+                              <m:ctrlPr>
+                                <w:rPr>
+                                  <w:rFonts w:ascii="Cambria Math" w:hAnsi="Cambria Math"/>
+                                  <w:i/>
+                                </w:rPr>
+                              </m:ctrlPr>
+                            </m:fPr>
+                            <m:num>
+                              <m:func>
+                                <m:funcPr>
+                                  <m:ctrlPr>
+                                    <w:rPr>
+                                      <w:rFonts w:ascii="Cambria Math" w:hAnsi="Cambria Math"/>
+                                      <w:i/>
+                                    </w:rPr>
+                                  </m:ctrlPr>
+                                </m:funcPr>
+                                <m:fName>
+                                  <m:r>
+                                    <m:rPr>
+                                      <m:sty m:val="p"/>
+                                    </m:rPr>
+                                    <w:rPr>
+                                      <w:rFonts w:ascii="Cambria Math" w:hAnsi="Cambria Math"/>
+                                    </w:rPr>
+                                    <m:t>log</m:t>
+                                  </m:r>
+                                </m:fName>
+                                <m:e>
+                                  <m:d>
+                                    <m:dPr>
+                                      <m:ctrlPr>
+                                        <w:rPr>
+                                          <w:rFonts w:ascii="Cambria Math" w:hAnsi="Cambria Math"/>
+                                          <w:i/>
+                                        </w:rPr>
+                                      </m:ctrlPr>
+                                    </m:dPr>
+                                    <m:e>
+                                      <m:f>
+                                        <m:fPr>
+                                          <m:ctrlPr>
+                                            <w:rPr>
+                                              <w:rFonts w:ascii="Cambria Math" w:hAnsi="Cambria Math"/>
+                                              <w:i/>
+                                            </w:rPr>
+                                          </m:ctrlPr>
+                                        </m:fPr>
+                                        <m:num>
+                                          <m:r>
+                                            <w:rPr>
+                                              <w:rFonts w:ascii="Cambria Math" w:hAnsi="Cambria Math"/>
+                                            </w:rPr>
+                                            <m:t>i</m:t>
+                                          </m:r>
+                                        </m:num>
+                                        <m:den>
+                                          <m:sSub>
+                                            <m:sSubPr>
+                                              <m:ctrlPr>
+                                                <w:rPr>
+                                                  <w:rFonts w:ascii="Cambria Math" w:hAnsi="Cambria Math"/>
+                                                  <w:i/>
+                                                </w:rPr>
+                                              </m:ctrlPr>
+                                            </m:sSubPr>
+                                            <m:e>
+                                              <m:r>
+                                                <w:rPr>
+                                                  <w:rFonts w:ascii="Cambria Math" w:hAnsi="Cambria Math"/>
+                                                </w:rPr>
+                                                <m:t>n</m:t>
+                                              </m:r>
+                                            </m:e>
+                                            <m:sub>
+                                              <m:r>
+                                                <w:rPr>
+                                                  <w:rFonts w:ascii="Cambria Math" w:hAnsi="Cambria Math"/>
+                                                </w:rPr>
+                                                <m:t>min</m:t>
+                                              </m:r>
+                                            </m:sub>
+                                          </m:sSub>
+                                        </m:den>
+                                      </m:f>
+                                    </m:e>
+                                  </m:d>
+                                </m:e>
+                              </m:func>
+                            </m:num>
+                            <m:den>
+                              <m:func>
+                                <m:funcPr>
+                                  <m:ctrlPr>
+                                    <w:rPr>
+                                      <w:rFonts w:ascii="Cambria Math" w:hAnsi="Cambria Math"/>
+                                      <w:i/>
+                                    </w:rPr>
+                                  </m:ctrlPr>
+                                </m:funcPr>
+                                <m:fName>
+                                  <m:r>
+                                    <m:rPr>
+                                      <m:sty m:val="p"/>
+                                    </m:rPr>
+                                    <w:rPr>
+                                      <w:rFonts w:ascii="Cambria Math" w:hAnsi="Cambria Math"/>
+                                    </w:rPr>
+                                    <m:t>log</m:t>
+                                  </m:r>
+                                </m:fName>
+                                <m:e>
+                                  <m:d>
+                                    <m:dPr>
+                                      <m:ctrlPr>
+                                        <w:rPr>
+                                          <w:rFonts w:ascii="Cambria Math" w:hAnsi="Cambria Math"/>
+                                          <w:i/>
+                                        </w:rPr>
+                                      </m:ctrlPr>
+                                    </m:dPr>
+                                    <m:e>
+                                      <m:f>
+                                        <m:fPr>
+                                          <m:ctrlPr>
+                                            <w:rPr>
+                                              <w:rFonts w:ascii="Cambria Math" w:hAnsi="Cambria Math"/>
+                                              <w:i/>
+                                            </w:rPr>
+                                          </m:ctrlPr>
+                                        </m:fPr>
+                                        <m:num>
+                                          <m:sSub>
+                                            <m:sSubPr>
+                                              <m:ctrlPr>
+                                                <w:rPr>
+                                                  <w:rFonts w:ascii="Cambria Math" w:hAnsi="Cambria Math"/>
+                                                  <w:i/>
+                                                </w:rPr>
+                                              </m:ctrlPr>
+                                            </m:sSubPr>
+                                            <m:e>
+                                              <m:r>
+                                                <w:rPr>
+                                                  <w:rFonts w:ascii="Cambria Math" w:hAnsi="Cambria Math"/>
+                                                </w:rPr>
+                                                <m:t>n</m:t>
+                                              </m:r>
+                                            </m:e>
+                                            <m:sub>
+                                              <m:r>
+                                                <w:rPr>
+                                                  <w:rFonts w:ascii="Cambria Math" w:hAnsi="Cambria Math"/>
+                                                </w:rPr>
+                                                <m:t>max</m:t>
+                                              </m:r>
+                                            </m:sub>
+                                          </m:sSub>
+                                        </m:num>
+                                        <m:den>
+                                          <m:sSub>
+                                            <m:sSubPr>
+                                              <m:ctrlPr>
+                                                <w:rPr>
+                                                  <w:rFonts w:ascii="Cambria Math" w:hAnsi="Cambria Math"/>
+                                                  <w:i/>
+                                                </w:rPr>
+                                              </m:ctrlPr>
+                                            </m:sSubPr>
+                                            <m:e>
+                                              <m:r>
+                                                <w:rPr>
+                                                  <w:rFonts w:ascii="Cambria Math" w:hAnsi="Cambria Math"/>
+                                                </w:rPr>
+                                                <m:t>n</m:t>
+                                              </m:r>
+                                            </m:e>
+                                            <m:sub>
+                                              <m:r>
+                                                <w:rPr>
+                                                  <w:rFonts w:ascii="Cambria Math" w:hAnsi="Cambria Math"/>
+                                                </w:rPr>
+                                                <m:t>min</m:t>
+                                              </m:r>
+                                            </m:sub>
+                                          </m:sSub>
+                                        </m:den>
+                                      </m:f>
+                                    </m:e>
+                                  </m:d>
+                                </m:e>
+                              </m:func>
+                            </m:den>
+                          </m:f>
+                        </m:oMath>
+                      </m:oMathPara>
+                    </w:p>
+                  </w:txbxContent>
+                </v:textbox>
+                <w10:wrap type="square" anchorx="margin"/>
+              </v:shape>
+            </w:pict>
+          </mc:Fallback>
+        </mc:AlternateContent>
+      </w:r>
+    </w:p>
+    <w:p>
+      <w:pPr>
+        <w:pStyle w:val="ListParagraph"/>
+        <w:rPr>
+          <w:rFonts w:eastAsiaTheme="minorEastAsia"/>
+        </w:rPr>
+      </w:pPr>
+    </w:p>
+    <w:p>
+      <w:pPr>
+        <w:pStyle w:val="ListParagraph"/>
+        <w:rPr>
+          <w:rFonts w:eastAsiaTheme="minorEastAsia"/>
+        </w:rPr>
+      </w:pPr>
+    </w:p>
+    <w:p>
+      <w:pPr>
+        <w:pStyle w:val="ListParagraph"/>
+        <w:rPr>
+          <w:rFonts w:eastAsiaTheme="minorEastAsia"/>
+        </w:rPr>
+      </w:pPr>
+    </w:p>
+    <w:p>
+      <w:pPr>
+        <w:pStyle w:val="ListParagraph"/>
+        <w:rPr>
+          <w:rFonts w:eastAsiaTheme="minorEastAsia"/>
+        </w:rPr>
+      </w:pPr>
+    </w:p>
+    <w:p>
+      <w:pPr>
+        <w:pStyle w:val="ListParagraph"/>
+        <w:rPr>
+          <w:rFonts w:eastAsiaTheme="minorEastAsia"/>
+        </w:rPr>
+      </w:pPr>
+    </w:p>
+    <w:p>
+      <w:pPr>
+        <w:pStyle w:val="ListParagraph"/>
+        <w:rPr>
+          <w:rFonts w:eastAsiaTheme="minorEastAsia"/>
+        </w:rPr>
+      </w:pPr>
+      <m:oMathPara>
+        <m:oMath>
+          <m:r>
+            <w:rPr>
+              <w:rFonts w:ascii="Cambria Math" w:eastAsiaTheme="minorEastAsia" w:hAnsi="Cambria Math"/>
+            </w:rPr>
+            <m:t>f:R→[0,1]</m:t>
+          </m:r>
+        </m:oMath>
+      </m:oMathPara>
+    </w:p>
+    <w:p>
+      <w:pPr>
+        <w:rPr>
+          <w:rFonts w:eastAsiaTheme="minorEastAsia"/>
+        </w:rPr>
+      </w:pPr>
+    </w:p>
+    <w:p>
+      <w:pPr>
+        <w:rPr>
+          <w:rFonts w:eastAsiaTheme="minorEastAsia"/>
+        </w:rPr>
+      </w:pPr>
+    </w:p>
+    <w:p>
+      <w:pPr>
+        <w:pStyle w:val="ListParagraph"/>
+        <w:numPr>
+          <w:ilvl w:val="0"/>
+          <w:numId w:val="2"/>
+        </w:numPr>
+        <w:rPr>
+          <w:rFonts w:eastAsiaTheme="minorEastAsia"/>
+        </w:rPr>
+      </w:pPr>
+      <w:r>
+        <w:rPr>
+          <w:rFonts w:eastAsiaTheme="minorEastAsia"/>
+          <w:b/>
+        </w:rPr>
+        <w:t xml:space="preserve">Density (D) – Defined for </w:t>
+      </w:r>
+      <w:proofErr w:type="spellStart"/>
+      <w:r>
+        <w:rPr>
+          <w:rFonts w:eastAsiaTheme="minorEastAsia"/>
+          <w:b/>
+        </w:rPr>
+        <w:t>solars</w:t>
+      </w:r>
+      <w:proofErr w:type="spellEnd"/>
+    </w:p>
+    <w:p>
+      <w:pPr>
+        <w:pStyle w:val="ListParagraph"/>
+        <w:rPr>
+          <w:rFonts w:eastAsiaTheme="minorEastAsia"/>
+        </w:rPr>
+      </w:pPr>
+    </w:p>
+    <w:p>
+      <w:pPr>
+        <w:pStyle w:val="ListParagraph"/>
+        <w:rPr>
+          <w:rFonts w:eastAsiaTheme="minorEastAsia"/>
+        </w:rPr>
+      </w:pPr>
+      <w:r>
+        <w:rPr>
+          <w:rFonts w:eastAsiaTheme="minorEastAsia"/>
+        </w:rPr>
+        <w:t xml:space="preserve">Density is a measure of how full a solar is with respect to </w:t>
+      </w:r>
+      <w:proofErr w:type="spellStart"/>
+      <w:r>
+        <w:rPr>
+          <w:rFonts w:eastAsiaTheme="minorEastAsia"/>
+        </w:rPr>
+        <w:t>it’s</w:t>
+      </w:r>
+      <w:proofErr w:type="spellEnd"/>
+      <w:r>
+        <w:rPr>
+          <w:rFonts w:eastAsiaTheme="minorEastAsia"/>
+        </w:rPr>
+        <w:t xml:space="preserve"> maximum member capacity </w:t>
+      </w:r>
+      <m:oMath>
+        <m:d>
+          <m:dPr>
+            <m:ctrlPr>
+              <w:rPr>
+                <w:rFonts w:ascii="Cambria Math" w:eastAsiaTheme="minorEastAsia" w:hAnsi="Cambria Math"/>
+                <w:i/>
+              </w:rPr>
+            </m:ctrlPr>
+          </m:dPr>
+          <m:e>
+            <m:sSub>
+              <m:sSubPr>
+                <m:ctrlPr>
+                  <w:rPr>
+                    <w:rFonts w:ascii="Cambria Math" w:eastAsiaTheme="minorEastAsia" w:hAnsi="Cambria Math"/>
+                    <w:i/>
+                  </w:rPr>
+                </m:ctrlPr>
+              </m:sSubPr>
+              <m:e>
+                <m:r>
+                  <w:rPr>
+                    <w:rFonts w:ascii="Cambria Math" w:eastAsiaTheme="minorEastAsia" w:hAnsi="Cambria Math"/>
+                  </w:rPr>
+                  <m:t>m</m:t>
+                </m:r>
+              </m:e>
+              <m:sub>
+                <m:r>
+                  <w:rPr>
+                    <w:rFonts w:ascii="Cambria Math" w:eastAsiaTheme="minorEastAsia" w:hAnsi="Cambria Math"/>
+                  </w:rPr>
+                  <m:t>max</m:t>
+                </m:r>
+              </m:sub>
+            </m:sSub>
+          </m:e>
+        </m:d>
+      </m:oMath>
+      <w:r>
+        <w:rPr>
+          <w:rFonts w:eastAsiaTheme="minorEastAsia"/>
+        </w:rPr>
+        <w:t>.</w:t>
+      </w:r>
+    </w:p>
+    <w:p>
+      <w:pPr>
+        <w:pStyle w:val="ListParagraph"/>
+        <w:rPr>
+          <w:rFonts w:eastAsiaTheme="minorEastAsia"/>
+        </w:rPr>
+      </w:pPr>
+    </w:p>
+    <w:p>
+      <w:pPr>
+        <w:pStyle w:val="ListParagraph"/>
+        <w:rPr>
+          <w:rFonts w:eastAsiaTheme="minorEastAsia"/>
+        </w:rPr>
+      </w:pPr>
+      <w:r>
+        <w:rPr>
+          <w:rFonts w:eastAsiaTheme="minorEastAsia"/>
+        </w:rPr>
+        <w:t>Function receives the number of current members (</w:t>
+      </w:r>
+      <m:oMath>
+        <m:r>
+          <w:rPr>
+            <w:rFonts w:ascii="Cambria Math" w:eastAsiaTheme="minorEastAsia" w:hAnsi="Cambria Math"/>
+          </w:rPr>
+          <m:t>m</m:t>
+        </m:r>
+      </m:oMath>
+      <w:r>
+        <w:rPr>
+          <w:rFonts w:eastAsiaTheme="minorEastAsia"/>
+        </w:rPr>
+        <w:t>) and calculates D.</w:t>
+      </w:r>
+    </w:p>
+    <w:p>
+      <w:pPr>
+        <w:pStyle w:val="ListParagraph"/>
+        <w:rPr>
+          <w:rFonts w:eastAsiaTheme="minorEastAsia"/>
+        </w:rPr>
+      </w:pPr>
+    </w:p>
+    <w:p>
+      <w:pPr>
+        <w:pStyle w:val="ListParagraph"/>
+        <w:rPr>
+          <w:rFonts w:eastAsiaTheme="minorEastAsia"/>
+        </w:rPr>
+      </w:pPr>
+      <w:r>
+        <w:rPr>
+          <w:rFonts w:eastAsiaTheme="minorEastAsia"/>
+          <w:noProof/>
+        </w:rPr>
+        <mc:AlternateContent>
+          <mc:Choice Requires="wps">
+            <w:drawing>
+              <wp:anchor distT="45720" distB="45720" distL="114300" distR="114300" simplePos="0" relativeHeight="251669504" behindDoc="1" locked="0" layoutInCell="1" allowOverlap="1">
+                <wp:simplePos x="0" y="0"/>
+                <wp:positionH relativeFrom="margin">
+                  <wp:align>center</wp:align>
+                </wp:positionH>
+                <wp:positionV relativeFrom="paragraph">
+                  <wp:posOffset>8255</wp:posOffset>
+                </wp:positionV>
+                <wp:extent cx="1424940" cy="510540"/>
+                <wp:effectExtent l="0" t="0" r="22860" b="22860"/>
+                <wp:wrapNone/>
+                <wp:docPr id="5" name="Text Box 2"/>
+                <wp:cNvGraphicFramePr>
+                  <a:graphicFrameLocks xmlns:a="http://schemas.openxmlformats.org/drawingml/2006/main"/>
+                </wp:cNvGraphicFramePr>
+                <a:graphic xmlns:a="http://schemas.openxmlformats.org/drawingml/2006/main">
+                  <a:graphicData uri="http://schemas.microsoft.com/office/word/2010/wordprocessingShape">
+                    <wps:wsp>
+                      <wps:cNvSpPr txBox="1">
+                        <a:spLocks noChangeArrowheads="1"/>
+                      </wps:cNvSpPr>
+                      <wps:spPr bwMode="auto">
+                        <a:xfrm>
+                          <a:off x="0" y="0"/>
+                          <a:ext cx="1424940" cy="510540"/>
+                        </a:xfrm>
+                        <a:prstGeom prst="rect">
+                          <a:avLst/>
+                        </a:prstGeom>
+                        <a:solidFill>
+                          <a:srgbClr val="FFFFFF"/>
+                        </a:solidFill>
+                        <a:ln w="9525">
+                          <a:solidFill>
+                            <a:srgbClr val="000000"/>
+                          </a:solidFill>
+                          <a:miter lim="800000"/>
+                          <a:headEnd/>
+                          <a:tailEnd/>
+                        </a:ln>
+                      </wps:spPr>
+                      <wps:txbx>
+                        <w:txbxContent>
+                          <w:p>
+                            <m:oMathPara>
+                              <m:oMath>
+                                <m:r>
+                                  <w:rPr>
+                                    <w:rFonts w:ascii="Cambria Math" w:hAnsi="Cambria Math"/>
+                                  </w:rPr>
+                                  <m:t>D=f</m:t>
+                                </m:r>
+                                <m:d>
+                                  <m:dPr>
+                                    <m:ctrlPr>
+                                      <w:rPr>
+                                        <w:rFonts w:ascii="Cambria Math" w:hAnsi="Cambria Math"/>
+                                        <w:i/>
+                                      </w:rPr>
+                                    </m:ctrlPr>
+                                  </m:dPr>
+                                  <m:e>
+                                    <m:r>
+                                      <w:rPr>
+                                        <w:rFonts w:ascii="Cambria Math" w:hAnsi="Cambria Math"/>
+                                      </w:rPr>
+                                      <m:t>m</m:t>
+                                    </m:r>
+                                  </m:e>
+                                </m:d>
+                                <m:r>
+                                  <w:rPr>
+                                    <w:rFonts w:ascii="Cambria Math" w:hAnsi="Cambria Math"/>
+                                  </w:rPr>
+                                  <m:t>=</m:t>
+                                </m:r>
+                                <m:f>
+                                  <m:fPr>
+                                    <m:ctrlPr>
+                                      <w:rPr>
+                                        <w:rFonts w:ascii="Cambria Math" w:hAnsi="Cambria Math"/>
+                                        <w:i/>
+                                      </w:rPr>
+                                    </m:ctrlPr>
+                                  </m:fPr>
+                                  <m:num>
+                                    <m:r>
+                                      <w:rPr>
+                                        <w:rFonts w:ascii="Cambria Math" w:hAnsi="Cambria Math"/>
+                                      </w:rPr>
+                                      <m:t>m</m:t>
+                                    </m:r>
+                                  </m:num>
+                                  <m:den>
+                                    <m:sSub>
+                                      <m:sSubPr>
+                                        <m:ctrlPr>
+                                          <w:rPr>
+                                            <w:rFonts w:ascii="Cambria Math" w:hAnsi="Cambria Math"/>
+                                            <w:i/>
+                                          </w:rPr>
+                                        </m:ctrlPr>
+                                      </m:sSubPr>
+                                      <m:e>
+                                        <m:r>
+                                          <w:rPr>
+                                            <w:rFonts w:ascii="Cambria Math" w:hAnsi="Cambria Math"/>
+                                          </w:rPr>
+                                          <m:t>m</m:t>
+                                        </m:r>
+                                      </m:e>
+                                      <m:sub>
+                                        <m:r>
+                                          <w:rPr>
+                                            <w:rFonts w:ascii="Cambria Math" w:hAnsi="Cambria Math"/>
+                                          </w:rPr>
+                                          <m:t>max</m:t>
+                                        </m:r>
+                                      </m:sub>
+                                    </m:sSub>
+                                  </m:den>
+                                </m:f>
+                              </m:oMath>
+                            </m:oMathPara>
+                          </w:p>
+                        </w:txbxContent>
+                      </wps:txbx>
+                      <wps:bodyPr rot="0" vert="horz" wrap="square" lIns="91440" tIns="45720" rIns="91440" bIns="45720" anchor="t" anchorCtr="0">
+                        <a:noAutofit/>
+                      </wps:bodyPr>
+                    </wps:wsp>
+                  </a:graphicData>
+                </a:graphic>
+                <wp14:sizeRelH relativeFrom="margin">
+                  <wp14:pctWidth>0</wp14:pctWidth>
+                </wp14:sizeRelH>
+                <wp14:sizeRelV relativeFrom="margin">
+                  <wp14:pctHeight>0</wp14:pctHeight>
+                </wp14:sizeRelV>
+              </wp:anchor>
+            </w:drawing>
+          </mc:Choice>
+          <mc:Fallback>
+            <w:pict>
+              <v:shape id="_x0000_s1031" type="#_x0000_t202" style="position:absolute;left:0;text-align:left;margin-left:0;margin-top:.65pt;width:112.2pt;height:40.2pt;z-index:-251646976;visibility:visible;mso-wrap-style:square;mso-width-percent:0;mso-height-percent:0;mso-wrap-distance-left:9pt;mso-wrap-distance-top:3.6pt;mso-wrap-distance-right:9pt;mso-wrap-distance-bottom:3.6pt;mso-position-horizontal:center;mso-position-horizontal-relative:margin;mso-position-vertical:absolute;mso-position-vertical-relative:text;mso-width-percent:0;mso-height-percent:0;mso-width-relative:margin;mso-height-relative:margin;v-text-anchor:top" o:gfxdata="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">
+                <v:textbox>
+                  <w:txbxContent>
+                    <w:p>
+                      <m:oMathPara>
+                        <m:oMath>
+                          <m:r>
+                            <w:rPr>
+                              <w:rFonts w:ascii="Cambria Math" w:hAnsi="Cambria Math"/>
+                            </w:rPr>
+                            <m:t>D=f</m:t>
+                          </m:r>
+                          <m:d>
+                            <m:dPr>
+                              <m:ctrlPr>
+                                <w:rPr>
+                                  <w:rFonts w:ascii="Cambria Math" w:hAnsi="Cambria Math"/>
+                                  <w:i/>
+                                </w:rPr>
+                              </m:ctrlPr>
+                            </m:dPr>
+                            <m:e>
+                              <m:r>
+                                <w:rPr>
+                                  <w:rFonts w:ascii="Cambria Math" w:hAnsi="Cambria Math"/>
+                                </w:rPr>
+                                <m:t>m</m:t>
+                              </m:r>
+                            </m:e>
+                          </m:d>
+                          <m:r>
+                            <w:rPr>
+                              <w:rFonts w:ascii="Cambria Math" w:hAnsi="Cambria Math"/>
+                            </w:rPr>
+                            <m:t>=</m:t>
+                          </m:r>
+                          <m:f>
+                            <m:fPr>
+                              <m:ctrlPr>
+                                <w:rPr>
+                                  <w:rFonts w:ascii="Cambria Math" w:hAnsi="Cambria Math"/>
+                                  <w:i/>
+                                </w:rPr>
+                              </m:ctrlPr>
+                            </m:fPr>
+                            <m:num>
+                              <m:r>
+                                <w:rPr>
+                                  <w:rFonts w:ascii="Cambria Math" w:hAnsi="Cambria Math"/>
+                                </w:rPr>
+                                <m:t>m</m:t>
+                              </m:r>
+                            </m:num>
+                            <m:den>
+                              <m:sSub>
+                                <m:sSubPr>
+                                  <m:ctrlPr>
+                                    <w:rPr>
+                                      <w:rFonts w:ascii="Cambria Math" w:hAnsi="Cambria Math"/>
+                                      <w:i/>
+                                    </w:rPr>
+                                  </m:ctrlPr>
+                                </m:sSubPr>
+                                <m:e>
+                                  <m:r>
+                                    <w:rPr>
+                                      <w:rFonts w:ascii="Cambria Math" w:hAnsi="Cambria Math"/>
+                                    </w:rPr>
+                                    <m:t>m</m:t>
+                                  </m:r>
+                                </m:e>
+                                <m:sub>
+                                  <m:r>
+                                    <w:rPr>
+                                      <w:rFonts w:ascii="Cambria Math" w:hAnsi="Cambria Math"/>
+                                    </w:rPr>
+                                    <m:t>max</m:t>
+                                  </m:r>
+                                </m:sub>
+                              </m:sSub>
+                            </m:den>
+                          </m:f>
+                        </m:oMath>
+                      </m:oMathPara>
+                    </w:p>
+                  </w:txbxContent>
+                </v:textbox>
+                <w10:wrap anchorx="margin"/>
+              </v:shape>
+            </w:pict>
+          </mc:Fallback>
+        </mc:AlternateContent>
+      </w:r>
+    </w:p>
+    <w:p>
+      <w:pPr>
+        <w:pStyle w:val="ListParagraph"/>
+        <w:rPr>
+          <w:rFonts w:eastAsiaTheme="minorEastAsia"/>
+        </w:rPr>
+      </w:pPr>
+    </w:p>
+    <w:p>
+      <w:pPr>
+        <w:pStyle w:val="ListParagraph"/>
+        <w:rPr>
+          <w:rFonts w:eastAsiaTheme="minorEastAsia"/>
+        </w:rPr>
+      </w:pPr>
+    </w:p>
+    <w:p>
+      <w:pPr>
+        <w:pStyle w:val="ListParagraph"/>
+        <w:rPr>
+          <w:rFonts w:eastAsiaTheme="minorEastAsia"/>
+        </w:rPr>
+      </w:pPr>
+    </w:p>
+    <w:p>
+      <w:pPr>
+        <w:pStyle w:val="ListParagraph"/>
+        <w:rPr>
+          <w:rFonts w:eastAsiaTheme="minorEastAsia"/>
+        </w:rPr>
+      </w:pPr>
+      <m:oMathPara>
+        <m:oMath>
+          <m:r>
+            <w:rPr>
+              <w:rFonts w:ascii="Cambria Math" w:eastAsiaTheme="minorEastAsia" w:hAnsi="Cambria Math"/>
+            </w:rPr>
+            <m:t>f:R→[0,1]</m:t>
+          </m:r>
+        </m:oMath>
+      </m:oMathPara>
+    </w:p>
+    <w:p>
+      <w:pPr>
+        <w:rPr>
+          <w:rFonts w:eastAsiaTheme="minorEastAsia"/>
+        </w:rPr>
+      </w:pPr>
+    </w:p>
+    <w:p>
+      <w:pPr>
+        <w:pStyle w:val="ListParagraph"/>
+        <w:numPr>
+          <w:ilvl w:val="0"/>
+          <w:numId w:val="2"/>
+        </w:numPr>
+        <w:rPr>
+          <w:rFonts w:eastAsiaTheme="minorEastAsia"/>
+        </w:rPr>
+      </w:pPr>
+      <w:r>
+        <w:rPr>
+          <w:rFonts w:eastAsiaTheme="minorEastAsia"/>
+          <w:b/>
+        </w:rPr>
+        <w:t xml:space="preserve">Entropy (E) – Defined for </w:t>
+      </w:r>
+      <w:proofErr w:type="spellStart"/>
+      <w:r>
+        <w:rPr>
+          <w:rFonts w:eastAsiaTheme="minorEastAsia"/>
+          <w:b/>
+        </w:rPr>
+        <w:t>solars</w:t>
+      </w:r>
+      <w:proofErr w:type="spellEnd"/>
+    </w:p>
+    <w:p>
+      <w:pPr>
+        <w:pStyle w:val="ListParagraph"/>
+        <w:rPr>
+          <w:rFonts w:eastAsiaTheme="minorEastAsia"/>
+        </w:rPr>
+      </w:pPr>
+    </w:p>
+    <w:p>
+      <w:pPr>
+        <w:pStyle w:val="ListParagraph"/>
+        <w:rPr>
+          <w:rFonts w:eastAsiaTheme="minorEastAsia"/>
+        </w:rPr>
+      </w:pPr>
+      <w:r>
+        <w:rPr>
+          <w:rFonts w:eastAsiaTheme="minorEastAsia"/>
+        </w:rPr>
+        <w:t xml:space="preserve">Entropy is a measure of how well distributed the total conversation is. </w:t>
+      </w:r>
+    </w:p>
+    <w:p>
+      <w:pPr>
+        <w:pStyle w:val="ListParagraph"/>
+        <w:rPr>
+          <w:rFonts w:eastAsiaTheme="minorEastAsia"/>
+        </w:rPr>
+      </w:pPr>
+    </w:p>
+    <w:p>
+      <w:pPr>
+        <w:pStyle w:val="ListParagraph"/>
+        <w:rPr>
+          <w:rFonts w:eastAsiaTheme="minorEastAsia"/>
+        </w:rPr>
+      </w:pPr>
+      <w:r>
+        <w:rPr>
+          <w:rFonts w:eastAsiaTheme="minorEastAsia"/>
+        </w:rPr>
+        <w:t xml:space="preserve">Function receives </w:t>
+      </w:r>
+      <w:proofErr w:type="spellStart"/>
+      <w:proofErr w:type="gramStart"/>
+      <w:r>
+        <w:rPr>
+          <w:rFonts w:eastAsiaTheme="minorEastAsia"/>
+        </w:rPr>
+        <w:t>Solar.msgdata.member</w:t>
+      </w:r>
+      <w:proofErr w:type="gramEnd"/>
+      <w:r>
+        <w:rPr>
+          <w:rFonts w:eastAsiaTheme="minorEastAsia"/>
+        </w:rPr>
+        <w:t>_data</w:t>
+      </w:r>
+      <w:proofErr w:type="spellEnd"/>
+      <w:r>
+        <w:rPr>
+          <w:rFonts w:eastAsiaTheme="minorEastAsia"/>
+        </w:rPr>
+        <w:t xml:space="preserve">, creates a list of all </w:t>
+      </w:r>
+      <m:oMath>
+        <m:sSub>
+          <m:sSubPr>
+            <m:ctrlPr>
+              <w:rPr>
+                <w:rFonts w:ascii="Cambria Math" w:eastAsiaTheme="minorEastAsia" w:hAnsi="Cambria Math"/>
+                <w:i/>
+              </w:rPr>
+            </m:ctrlPr>
+          </m:sSubPr>
+          <m:e>
+            <m:r>
+              <w:rPr>
+                <w:rFonts w:ascii="Cambria Math" w:eastAsiaTheme="minorEastAsia" w:hAnsi="Cambria Math"/>
+              </w:rPr>
+              <m:t>n</m:t>
+            </m:r>
+          </m:e>
+          <m:sub>
+            <m:r>
+              <w:rPr>
+                <w:rFonts w:ascii="Cambria Math" w:eastAsiaTheme="minorEastAsia" w:hAnsi="Cambria Math"/>
+              </w:rPr>
+              <m:t>i</m:t>
+            </m:r>
+          </m:sub>
+        </m:sSub>
+      </m:oMath>
+      <w:r>
+        <w:rPr>
+          <w:rFonts w:eastAsiaTheme="minorEastAsia"/>
+        </w:rPr>
+        <w:t xml:space="preserve"> and calculates their mean </w:t>
+      </w:r>
+      <m:oMath>
+        <m:bar>
+          <m:barPr>
+            <m:pos m:val="top"/>
+            <m:ctrlPr>
+              <w:rPr>
+                <w:rFonts w:ascii="Cambria Math" w:eastAsiaTheme="minorEastAsia" w:hAnsi="Cambria Math"/>
+                <w:i/>
+              </w:rPr>
+            </m:ctrlPr>
+          </m:barPr>
+          <m:e>
+            <m:r>
+              <w:rPr>
+                <w:rFonts w:ascii="Cambria Math" w:eastAsiaTheme="minorEastAsia" w:hAnsi="Cambria Math"/>
+              </w:rPr>
+              <m:t>M</m:t>
+            </m:r>
+          </m:e>
+        </m:bar>
+      </m:oMath>
+      <w:r>
+        <w:rPr>
+          <w:rFonts w:eastAsiaTheme="minorEastAsia"/>
+        </w:rPr>
+        <w:t xml:space="preserve"> and calculates </w:t>
+      </w:r>
+      <w:r>
+        <w:rPr>
+          <w:rFonts w:eastAsiaTheme="minorEastAsia"/>
+        </w:rPr>
+        <w:t>variance and h</w:t>
+      </w:r>
+      <w:r>
+        <w:rPr>
+          <w:rFonts w:eastAsiaTheme="minorEastAsia"/>
+        </w:rPr>
+        <w:t>e</w:t>
+      </w:r>
+      <w:r>
+        <w:rPr>
+          <w:rFonts w:eastAsiaTheme="minorEastAsia"/>
+        </w:rPr>
+        <w:t>nce standard deviation using the formula.</w:t>
+      </w:r>
+    </w:p>
+    <w:p>
+      <w:pPr>
+        <w:pStyle w:val="ListParagraph"/>
+        <w:rPr>
+          <w:rFonts w:eastAsiaTheme="minorEastAsia"/>
+        </w:rPr>
+      </w:pPr>
+    </w:p>
+    <w:p>
+      <w:pPr>
+        <w:pStyle w:val="ListParagraph"/>
+        <w:rPr>
+          <w:rFonts w:eastAsiaTheme="minorEastAsia"/>
+        </w:rPr>
+      </w:pPr>
+      <m:oMathPara>
+        <m:oMath>
+          <m:r>
+            <w:rPr>
+              <w:rFonts w:ascii="Cambria Math" w:eastAsiaTheme="minorEastAsia" w:hAnsi="Cambria Math"/>
+            </w:rPr>
+            <m:t>d=</m:t>
+          </m:r>
+          <m:rad>
+            <m:radPr>
+              <m:degHide m:val="1"/>
+              <m:ctrlPr>
+                <w:rPr>
+                  <w:rFonts w:ascii="Cambria Math" w:eastAsiaTheme="minorEastAsia" w:hAnsi="Cambria Math"/>
+                  <w:i/>
+                </w:rPr>
+              </m:ctrlPr>
+            </m:radPr>
+            <m:deg/>
+            <m:e>
+              <m:f>
+                <m:fPr>
+                  <m:ctrlPr>
+                    <w:rPr>
+                      <w:rFonts w:ascii="Cambria Math" w:eastAsiaTheme="minorEastAsia" w:hAnsi="Cambria Math"/>
+                      <w:i/>
+                    </w:rPr>
+                  </m:ctrlPr>
+                </m:fPr>
+                <m:num>
+                  <m:r>
+                    <w:rPr>
+                      <w:rFonts w:ascii="Cambria Math" w:eastAsiaTheme="minorEastAsia" w:hAnsi="Cambria Math"/>
+                    </w:rPr>
+                    <m:t>1</m:t>
+                  </m:r>
+                </m:num>
+                <m:den>
+                  <m:r>
+                    <w:rPr>
+                      <w:rFonts w:ascii="Cambria Math" w:eastAsiaTheme="minorEastAsia" w:hAnsi="Cambria Math"/>
+                    </w:rPr>
+                    <m:t>n</m:t>
+                  </m:r>
+                </m:den>
+              </m:f>
+              <m:nary>
+                <m:naryPr>
+                  <m:chr m:val="∑"/>
+                  <m:limLoc m:val="undOvr"/>
+                  <m:ctrlPr>
+                    <w:rPr>
+                      <w:rFonts w:ascii="Cambria Math" w:eastAsiaTheme="minorEastAsia" w:hAnsi="Cambria Math"/>
+                      <w:i/>
+                    </w:rPr>
+                  </m:ctrlPr>
+                </m:naryPr>
+                <m:sub>
+                  <m:r>
+                    <w:rPr>
+                      <w:rFonts w:ascii="Cambria Math" w:eastAsiaTheme="minorEastAsia" w:hAnsi="Cambria Math"/>
+                    </w:rPr>
+                    <m:t>i=0</m:t>
+                  </m:r>
+                </m:sub>
+                <m:sup>
+                  <m:r>
+                    <w:rPr>
+                      <w:rFonts w:ascii="Cambria Math" w:eastAsiaTheme="minorEastAsia" w:hAnsi="Cambria Math"/>
+                    </w:rPr>
+                    <m:t>n</m:t>
+                  </m:r>
+                </m:sup>
+                <m:e>
+                  <m:sSup>
+                    <m:sSupPr>
+                      <m:ctrlPr>
+                        <w:rPr>
+                          <w:rFonts w:ascii="Cambria Math" w:eastAsiaTheme="minorEastAsia" w:hAnsi="Cambria Math"/>
+                          <w:i/>
+                        </w:rPr>
+                      </m:ctrlPr>
+                    </m:sSupPr>
+                    <m:e>
+                      <m:d>
+                        <m:dPr>
+                          <m:ctrlPr>
+                            <w:rPr>
+                              <w:rFonts w:ascii="Cambria Math" w:eastAsiaTheme="minorEastAsia" w:hAnsi="Cambria Math"/>
+                              <w:i/>
+                            </w:rPr>
+                          </m:ctrlPr>
+                        </m:dPr>
+                        <m:e>
+                          <m:sSub>
+                            <m:sSubPr>
+                              <m:ctrlPr>
+                                <w:rPr>
+                                  <w:rFonts w:ascii="Cambria Math" w:eastAsiaTheme="minorEastAsia" w:hAnsi="Cambria Math"/>
+                                  <w:i/>
+                                </w:rPr>
+                              </m:ctrlPr>
+                            </m:sSubPr>
+                            <m:e>
+                              <m:r>
+                                <w:rPr>
+                                  <w:rFonts w:ascii="Cambria Math" w:eastAsiaTheme="minorEastAsia" w:hAnsi="Cambria Math"/>
+                                </w:rPr>
+                                <m:t>x</m:t>
+                              </m:r>
+                            </m:e>
+                            <m:sub>
+                              <m:r>
+                                <w:rPr>
+                                  <w:rFonts w:ascii="Cambria Math" w:eastAsiaTheme="minorEastAsia" w:hAnsi="Cambria Math"/>
+                                </w:rPr>
+                                <m:t>i</m:t>
+                              </m:r>
+                            </m:sub>
+                          </m:sSub>
+                          <m:r>
+                            <w:rPr>
+                              <w:rFonts w:ascii="Cambria Math" w:eastAsiaTheme="minorEastAsia" w:hAnsi="Cambria Math"/>
+                            </w:rPr>
+                            <m:t>-</m:t>
+                          </m:r>
+                          <m:bar>
+                            <m:barPr>
+                              <m:pos m:val="top"/>
+                              <m:ctrlPr>
+                                <w:rPr>
+                                  <w:rFonts w:ascii="Cambria Math" w:eastAsiaTheme="minorEastAsia" w:hAnsi="Cambria Math"/>
+                                  <w:i/>
+                                </w:rPr>
+                              </m:ctrlPr>
+                            </m:barPr>
+                            <m:e>
+                              <m:r>
+                                <w:rPr>
+                                  <w:rFonts w:ascii="Cambria Math" w:eastAsiaTheme="minorEastAsia" w:hAnsi="Cambria Math"/>
+                                </w:rPr>
+                                <m:t>M</m:t>
+                              </m:r>
+                            </m:e>
+                          </m:bar>
+                        </m:e>
+                      </m:d>
+                    </m:e>
+                    <m:sup>
+                      <m:r>
+                        <w:rPr>
+                          <w:rFonts w:ascii="Cambria Math" w:eastAsiaTheme="minorEastAsia" w:hAnsi="Cambria Math"/>
+                        </w:rPr>
+                        <m:t>2</m:t>
+                      </m:r>
+                    </m:sup>
+                  </m:sSup>
+                </m:e>
+              </m:nary>
+            </m:e>
+          </m:rad>
+        </m:oMath>
+      </m:oMathPara>
+    </w:p>
+    <w:p>
+      <w:pPr>
+        <w:ind w:left="720"/>
+        <w:rPr>
+          <w:rFonts w:eastAsiaTheme="minorEastAsia"/>
+        </w:rPr>
+      </w:pPr>
+      <w:r>
+        <w:rPr>
+          <w:rFonts w:eastAsiaTheme="minorEastAsia"/>
+        </w:rPr>
+        <w:t xml:space="preserve">Now, d can reach a max of </w:t>
+      </w:r>
+      <m:oMath>
+        <m:f>
+          <m:fPr>
+            <m:ctrlPr>
+              <w:rPr>
+                <w:rFonts w:ascii="Cambria Math" w:eastAsiaTheme="minorEastAsia" w:hAnsi="Cambria Math"/>
+                <w:i/>
+              </w:rPr>
+            </m:ctrlPr>
+          </m:fPr>
+          <m:num>
+            <m:d>
+              <m:dPr>
+                <m:ctrlPr>
+                  <w:rPr>
+                    <w:rFonts w:ascii="Cambria Math" w:eastAsiaTheme="minorEastAsia" w:hAnsi="Cambria Math"/>
+                    <w:i/>
+                  </w:rPr>
+                </m:ctrlPr>
+              </m:dPr>
+              <m:e>
+                <m:sSub>
+                  <m:sSubPr>
+                    <m:ctrlPr>
+                      <w:rPr>
+                        <w:rFonts w:ascii="Cambria Math" w:eastAsiaTheme="minorEastAsia" w:hAnsi="Cambria Math"/>
+                        <w:i/>
+                      </w:rPr>
+                    </m:ctrlPr>
+                  </m:sSubPr>
+                  <m:e>
+                    <m:r>
+                      <w:rPr>
+                        <w:rFonts w:ascii="Cambria Math" w:eastAsiaTheme="minorEastAsia" w:hAnsi="Cambria Math"/>
+                      </w:rPr>
+                      <m:t>n</m:t>
+                    </m:r>
+                  </m:e>
+                  <m:sub>
+                    <m:r>
+                      <w:rPr>
+                        <w:rFonts w:ascii="Cambria Math" w:eastAsiaTheme="minorEastAsia" w:hAnsi="Cambria Math"/>
+                      </w:rPr>
+                      <m:t>max</m:t>
+                    </m:r>
+                  </m:sub>
+                </m:sSub>
+                <m:r>
+                  <w:rPr>
+                    <w:rFonts w:ascii="Cambria Math" w:eastAsiaTheme="minorEastAsia" w:hAnsi="Cambria Math"/>
+                  </w:rPr>
+                  <m:t>-</m:t>
+                </m:r>
+                <m:sSub>
+                  <m:sSubPr>
+                    <m:ctrlPr>
+                      <w:rPr>
+                        <w:rFonts w:ascii="Cambria Math" w:eastAsiaTheme="minorEastAsia" w:hAnsi="Cambria Math"/>
+                        <w:i/>
+                      </w:rPr>
+                    </m:ctrlPr>
+                  </m:sSubPr>
+                  <m:e>
+                    <m:r>
+                      <w:rPr>
+                        <w:rFonts w:ascii="Cambria Math" w:eastAsiaTheme="minorEastAsia" w:hAnsi="Cambria Math"/>
+                      </w:rPr>
+                      <m:t>n</m:t>
+                    </m:r>
+                  </m:e>
+                  <m:sub>
+                    <m:r>
+                      <w:rPr>
+                        <w:rFonts w:ascii="Cambria Math" w:eastAsiaTheme="minorEastAsia" w:hAnsi="Cambria Math"/>
+                      </w:rPr>
+                      <m:t>min</m:t>
+                    </m:r>
+                  </m:sub>
+                </m:sSub>
+              </m:e>
+            </m:d>
+          </m:num>
+          <m:den>
+            <m:r>
+              <w:rPr>
+                <w:rFonts w:ascii="Cambria Math" w:eastAsiaTheme="minorEastAsia" w:hAnsi="Cambria Math"/>
+              </w:rPr>
+              <m:t>2</m:t>
+            </m:r>
+          </m:den>
+        </m:f>
+      </m:oMath>
+      <w:r>
+        <w:rPr>
+          <w:rFonts w:eastAsiaTheme="minorEastAsia"/>
+        </w:rPr>
+        <w:t>, so we now map the value to [0,1]. Zero meaning max deviation hence low distributivity and one meaning ideal distribution of text messages.</w:t>
+      </w:r>
+    </w:p>
+    <w:p>
+      <w:pPr>
+        <w:ind w:left="720"/>
+        <w:rPr>
+          <w:rFonts w:eastAsiaTheme="minorEastAsia"/>
+        </w:rPr>
+      </w:pPr>
+      <w:r>
+        <w:rPr>
+          <w:rFonts w:eastAsiaTheme="minorEastAsia"/>
+          <w:noProof/>
+        </w:rPr>
+        <mc:AlternateContent>
+          <mc:Choice Requires="wps">
+            <w:drawing>
+              <wp:anchor distT="45720" distB="45720" distL="114300" distR="114300" simplePos="0" relativeHeight="251671552" behindDoc="1" locked="0" layoutInCell="1" allowOverlap="1">
+                <wp:simplePos x="0" y="0"/>
+                <wp:positionH relativeFrom="margin">
+                  <wp:align>center</wp:align>
+                </wp:positionH>
+                <wp:positionV relativeFrom="paragraph">
+                  <wp:posOffset>133350</wp:posOffset>
+                </wp:positionV>
+                <wp:extent cx="2087880" cy="533400"/>
+                <wp:effectExtent l="0" t="0" r="26670" b="19050"/>
+                <wp:wrapNone/>
+                <wp:docPr id="6" name="Text Box 2"/>
+                <wp:cNvGraphicFramePr>
+                  <a:graphicFrameLocks xmlns:a="http://schemas.openxmlformats.org/drawingml/2006/main"/>
+                </wp:cNvGraphicFramePr>
+                <a:graphic xmlns:a="http://schemas.openxmlformats.org/drawingml/2006/main">
+                  <a:graphicData uri="http://schemas.microsoft.com/office/word/2010/wordprocessingShape">
+                    <wps:wsp>
+                      <wps:cNvSpPr txBox="1">
+                        <a:spLocks noChangeArrowheads="1"/>
+                      </wps:cNvSpPr>
+                      <wps:spPr bwMode="auto">
+                        <a:xfrm>
+                          <a:off x="0" y="0"/>
+                          <a:ext cx="2087880" cy="533400"/>
+                        </a:xfrm>
+                        <a:prstGeom prst="rect">
+                          <a:avLst/>
+                        </a:prstGeom>
+                        <a:solidFill>
+                          <a:srgbClr val="FFFFFF"/>
+                        </a:solidFill>
+                        <a:ln w="9525">
+                          <a:solidFill>
+                            <a:srgbClr val="000000"/>
+                          </a:solidFill>
+                          <a:miter lim="800000"/>
+                          <a:headEnd/>
+                          <a:tailEnd/>
+                        </a:ln>
+                      </wps:spPr>
+                      <wps:txbx>
+                        <w:txbxContent>
+                          <w:p>
+                            <m:oMathPara>
+                              <m:oMath>
+                                <m:r>
+                                  <w:rPr>
+                                    <w:rFonts w:ascii="Cambria Math" w:hAnsi="Cambria Math"/>
+                                  </w:rPr>
+                                  <m:t>E=f</m:t>
+                                </m:r>
+                                <m:d>
+                                  <m:dPr>
+                                    <m:ctrlPr>
+                                      <w:rPr>
+                                        <w:rFonts w:ascii="Cambria Math" w:hAnsi="Cambria Math"/>
+                                        <w:i/>
+                                      </w:rPr>
+                                    </m:ctrlPr>
+                                  </m:dPr>
+                                  <m:e>
+                                    <m:r>
+                                      <w:rPr>
+                                        <w:rFonts w:ascii="Cambria Math" w:hAnsi="Cambria Math"/>
+                                      </w:rPr>
+                                      <m:t>d</m:t>
+                                    </m:r>
+                                  </m:e>
+                                </m:d>
+                                <m:r>
+                                  <w:rPr>
+                                    <w:rFonts w:ascii="Cambria Math" w:hAnsi="Cambria Math"/>
+                                  </w:rPr>
+                                  <m:t>=</m:t>
+                                </m:r>
+                                <m:r>
+                                  <w:rPr>
+                                    <w:rFonts w:ascii="Cambria Math" w:hAnsi="Cambria Math"/>
+                                  </w:rPr>
+                                  <m:t>1-</m:t>
+                                </m:r>
+                                <m:f>
+                                  <m:fPr>
+                                    <m:ctrlPr>
+                                      <w:rPr>
+                                        <w:rFonts w:ascii="Cambria Math" w:hAnsi="Cambria Math"/>
+                                        <w:i/>
+                                      </w:rPr>
+                                    </m:ctrlPr>
+                                  </m:fPr>
+                                  <m:num>
+                                    <m:func>
+                                      <m:funcPr>
+                                        <m:ctrlPr>
+                                          <w:rPr>
+                                            <w:rFonts w:ascii="Cambria Math" w:hAnsi="Cambria Math"/>
+                                            <w:i/>
+                                          </w:rPr>
+                                        </m:ctrlPr>
+                                      </m:funcPr>
+                                      <m:fName>
+                                        <m:r>
+                                          <m:rPr>
+                                            <m:sty m:val="p"/>
+                                          </m:rPr>
+                                          <w:rPr>
+                                            <w:rFonts w:ascii="Cambria Math" w:hAnsi="Cambria Math"/>
+                                          </w:rPr>
+                                          <m:t>log</m:t>
+                                        </m:r>
+                                      </m:fName>
+                                      <m:e>
+                                        <m:r>
+                                          <w:rPr>
+                                            <w:rFonts w:ascii="Cambria Math" w:hAnsi="Cambria Math"/>
+                                          </w:rPr>
+                                          <m:t>d</m:t>
+                                        </m:r>
+                                        <m:r>
+                                          <w:rPr>
+                                            <w:rFonts w:ascii="Cambria Math" w:hAnsi="Cambria Math"/>
+                                          </w:rPr>
+                                          <m:t>+1</m:t>
+                                        </m:r>
+                                      </m:e>
+                                    </m:func>
+                                  </m:num>
+                                  <m:den>
+                                    <m:func>
+                                      <m:funcPr>
+                                        <m:ctrlPr>
+                                          <w:rPr>
+                                            <w:rFonts w:ascii="Cambria Math" w:hAnsi="Cambria Math"/>
+                                            <w:i/>
+                                          </w:rPr>
+                                        </m:ctrlPr>
+                                      </m:funcPr>
+                                      <m:fName>
+                                        <m:r>
+                                          <m:rPr>
+                                            <m:sty m:val="p"/>
+                                          </m:rPr>
+                                          <w:rPr>
+                                            <w:rFonts w:ascii="Cambria Math" w:hAnsi="Cambria Math"/>
+                                          </w:rPr>
+                                          <m:t>log</m:t>
+                                        </m:r>
+                                      </m:fName>
+                                      <m:e>
+                                        <m:sSub>
+                                          <m:sSubPr>
+                                            <m:ctrlPr>
+                                              <w:rPr>
+                                                <w:rFonts w:ascii="Cambria Math" w:hAnsi="Cambria Math"/>
+                                                <w:i/>
+                                              </w:rPr>
+                                            </m:ctrlPr>
+                                          </m:sSubPr>
+                                          <m:e>
+                                            <m:r>
+                                              <w:rPr>
+                                                <w:rFonts w:ascii="Cambria Math" w:hAnsi="Cambria Math"/>
+                                              </w:rPr>
+                                              <m:t>d</m:t>
+                                            </m:r>
+                                          </m:e>
+                                          <m:sub>
+                                            <m:r>
+                                              <w:rPr>
+                                                <w:rFonts w:ascii="Cambria Math" w:hAnsi="Cambria Math"/>
+                                              </w:rPr>
+                                              <m:t>max</m:t>
+                                            </m:r>
+                                          </m:sub>
+                                        </m:sSub>
+                                        <m:r>
+                                          <w:rPr>
+                                            <w:rFonts w:ascii="Cambria Math" w:hAnsi="Cambria Math"/>
+                                          </w:rPr>
+                                          <m:t>+1</m:t>
+                                        </m:r>
+                                      </m:e>
+                                    </m:func>
+                                  </m:den>
+                                </m:f>
+                              </m:oMath>
+                            </m:oMathPara>
+                          </w:p>
+                        </w:txbxContent>
+                      </wps:txbx>
+                      <wps:bodyPr rot="0" vert="horz" wrap="square" lIns="91440" tIns="45720" rIns="91440" bIns="45720" anchor="t" anchorCtr="0">
+                        <a:noAutofit/>
+                      </wps:bodyPr>
+                    </wps:wsp>
+                  </a:graphicData>
+                </a:graphic>
+                <wp14:sizeRelH relativeFrom="margin">
+                  <wp14:pctWidth>0</wp14:pctWidth>
+                </wp14:sizeRelH>
+                <wp14:sizeRelV relativeFrom="margin">
+                  <wp14:pctHeight>0</wp14:pctHeight>
+                </wp14:sizeRelV>
+              </wp:anchor>
+            </w:drawing>
+          </mc:Choice>
+          <mc:Fallback>
+            <w:pict>
+              <v:shape id="_x0000_s1032" type="#_x0000_t202" style="position:absolute;left:0;text-align:left;margin-left:0;margin-top:10.5pt;width:164.4pt;height:42pt;z-index:-251644928;visibility:visible;mso-wrap-style:square;mso-width-percent:0;mso-height-percent:0;mso-wrap-distance-left:9pt;mso-wrap-distance-top:3.6pt;mso-wrap-distance-right:9pt;mso-wrap-distance-bottom:3.6pt;mso-position-horizontal:center;mso-position-horizontal-relative:margin;mso-position-vertical:absolute;mso-position-vertical-relative:text;mso-width-percent:0;mso-height-percent:0;mso-width-relative:margin;mso-height-relative:margin;v-text-anchor:top" o:gfxdata="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">
+                <v:textbox>
+                  <w:txbxContent>
+                    <w:p>
+                      <m:oMathPara>
+                        <m:oMath>
+                          <m:r>
+                            <w:rPr>
+                              <w:rFonts w:ascii="Cambria Math" w:hAnsi="Cambria Math"/>
+                            </w:rPr>
+                            <m:t>E=f</m:t>
+                          </m:r>
+                          <m:d>
+                            <m:dPr>
+                              <m:ctrlPr>
+                                <w:rPr>
+                                  <w:rFonts w:ascii="Cambria Math" w:hAnsi="Cambria Math"/>
+                                  <w:i/>
+                                </w:rPr>
+                              </m:ctrlPr>
+                            </m:dPr>
+                            <m:e>
+                              <m:r>
+                                <w:rPr>
+                                  <w:rFonts w:ascii="Cambria Math" w:hAnsi="Cambria Math"/>
+                                </w:rPr>
+                                <m:t>d</m:t>
+                              </m:r>
+                            </m:e>
+                          </m:d>
+                          <m:r>
+                            <w:rPr>
+                              <w:rFonts w:ascii="Cambria Math" w:hAnsi="Cambria Math"/>
+                            </w:rPr>
+                            <m:t>=</m:t>
+                          </m:r>
+                          <m:r>
+                            <w:rPr>
+                              <w:rFonts w:ascii="Cambria Math" w:hAnsi="Cambria Math"/>
+                            </w:rPr>
+                            <m:t>1-</m:t>
+                          </m:r>
+                          <m:f>
+                            <m:fPr>
+                              <m:ctrlPr>
+                                <w:rPr>
+                                  <w:rFonts w:ascii="Cambria Math" w:hAnsi="Cambria Math"/>
+                                  <w:i/>
+                                </w:rPr>
+                              </m:ctrlPr>
+                            </m:fPr>
+                            <m:num>
+                              <m:func>
+                                <m:funcPr>
+                                  <m:ctrlPr>
+                                    <w:rPr>
+                                      <w:rFonts w:ascii="Cambria Math" w:hAnsi="Cambria Math"/>
+                                      <w:i/>
+                                    </w:rPr>
+                                  </m:ctrlPr>
+                                </m:funcPr>
+                                <m:fName>
+                                  <m:r>
+                                    <m:rPr>
+                                      <m:sty m:val="p"/>
+                                    </m:rPr>
+                                    <w:rPr>
+                                      <w:rFonts w:ascii="Cambria Math" w:hAnsi="Cambria Math"/>
+                                    </w:rPr>
+                                    <m:t>log</m:t>
+                                  </m:r>
+                                </m:fName>
+                                <m:e>
+                                  <m:r>
+                                    <w:rPr>
+                                      <w:rFonts w:ascii="Cambria Math" w:hAnsi="Cambria Math"/>
+                                    </w:rPr>
+                                    <m:t>d</m:t>
+                                  </m:r>
+                                  <m:r>
+                                    <w:rPr>
+                                      <w:rFonts w:ascii="Cambria Math" w:hAnsi="Cambria Math"/>
+                                    </w:rPr>
+                                    <m:t>+1</m:t>
+                                  </m:r>
+                                </m:e>
+                              </m:func>
+                            </m:num>
+                            <m:den>
+                              <m:func>
+                                <m:funcPr>
+                                  <m:ctrlPr>
+                                    <w:rPr>
+                                      <w:rFonts w:ascii="Cambria Math" w:hAnsi="Cambria Math"/>
+                                      <w:i/>
+                                    </w:rPr>
+                                  </m:ctrlPr>
+                                </m:funcPr>
+                                <m:fName>
+                                  <m:r>
+                                    <m:rPr>
+                                      <m:sty m:val="p"/>
+                                    </m:rPr>
+                                    <w:rPr>
+                                      <w:rFonts w:ascii="Cambria Math" w:hAnsi="Cambria Math"/>
+                                    </w:rPr>
+                                    <m:t>log</m:t>
+                                  </m:r>
+                                </m:fName>
+                                <m:e>
+                                  <m:sSub>
+                                    <m:sSubPr>
+                                      <m:ctrlPr>
+                                        <w:rPr>
+                                          <w:rFonts w:ascii="Cambria Math" w:hAnsi="Cambria Math"/>
+                                          <w:i/>
+                                        </w:rPr>
+                                      </m:ctrlPr>
+                                    </m:sSubPr>
+                                    <m:e>
+                                      <m:r>
+                                        <w:rPr>
+                                          <w:rFonts w:ascii="Cambria Math" w:hAnsi="Cambria Math"/>
+                                        </w:rPr>
+                                        <m:t>d</m:t>
+                                      </m:r>
+                                    </m:e>
+                                    <m:sub>
+                                      <m:r>
+                                        <w:rPr>
+                                          <w:rFonts w:ascii="Cambria Math" w:hAnsi="Cambria Math"/>
+                                        </w:rPr>
+                                        <m:t>max</m:t>
+                                      </m:r>
+                                    </m:sub>
+                                  </m:sSub>
+                                  <m:r>
+                                    <w:rPr>
+                                      <w:rFonts w:ascii="Cambria Math" w:hAnsi="Cambria Math"/>
+                                    </w:rPr>
+                                    <m:t>+1</m:t>
+                                  </m:r>
+                                </m:e>
+                              </m:func>
+                            </m:den>
+                          </m:f>
+                        </m:oMath>
+                      </m:oMathPara>
+                    </w:p>
+                  </w:txbxContent>
+                </v:textbox>
+                <w10:wrap anchorx="margin"/>
+              </v:shape>
+            </w:pict>
+          </mc:Fallback>
+        </mc:AlternateContent>
+      </w:r>
+    </w:p>
+    <w:p>
+      <w:pPr>
+        <w:ind w:left="720"/>
+        <w:rPr>
+          <w:rFonts w:eastAsiaTheme="minorEastAsia"/>
+        </w:rPr>
+      </w:pPr>
+    </w:p>
+    <w:p>
+      <w:pPr>
+        <w:ind w:left="720"/>
+        <w:rPr>
+          <w:rFonts w:eastAsiaTheme="minorEastAsia"/>
+        </w:rPr>
+      </w:pPr>
+    </w:p>
+    <w:p>
+      <w:pPr>
+        <w:ind w:left="720"/>
+        <w:rPr>
+          <w:rFonts w:eastAsiaTheme="minorEastAsia"/>
+        </w:rPr>
+      </w:pPr>
+      <m:oMathPara>
+        <m:oMath>
+          <m:r>
+            <w:rPr>
+              <w:rFonts w:ascii="Cambria Math" w:eastAsiaTheme="minorEastAsia" w:hAnsi="Cambria Math"/>
+            </w:rPr>
+            <m:t>f:R→</m:t>
+          </m:r>
+          <m:d>
+            <m:dPr>
+              <m:begChr m:val="["/>
+              <m:endChr m:val="]"/>
+              <m:ctrlPr>
+                <w:rPr>
+                  <w:rFonts w:ascii="Cambria Math" w:eastAsiaTheme="minorEastAsia" w:hAnsi="Cambria Math"/>
+                  <w:i/>
+                </w:rPr>
+              </m:ctrlPr>
+            </m:dPr>
+            <m:e>
+              <m:r>
+                <w:rPr>
+                  <w:rFonts w:ascii="Cambria Math" w:eastAsiaTheme="minorEastAsia" w:hAnsi="Cambria Math"/>
+                </w:rPr>
+                <m:t>0,1</m:t>
+              </m:r>
+            </m:e>
+          </m:d>
+        </m:oMath>
+      </m:oMathPara>
+      <w:bookmarkStart w:id="0" w:name="_GoBack"/>
+      <w:bookmarkEnd w:id="0"/>
     </w:p>
     <w:sectPr>
       <w:pgSz w:w="11906" w:h="16838"/>

</xml_diff>